<commit_message>
added table of content
some final details
</commit_message>
<xml_diff>
--- a/CA 20% - Project.docx
+++ b/CA 20% - Project.docx
@@ -1202,6 +1202,15 @@
           <w:color w:val="156082"/>
           <w:sz w:val="32"/>
           <w:szCs w:val="32"/>
+        </w:rPr>
+      </w:pPr>
+      <w:r>
+        <w:rPr>
+          <w:rFonts w:ascii="Times New Roman" w:hAnsi="Times New Roman" w:cs="Times New Roman"/>
+          <w:i/>
+          <w:color w:val="156082"/>
+          <w:sz w:val="32"/>
+          <w:szCs w:val="32"/>
           <w:rPrChange w:id="50" w:author="Nicolas Cancino" w:date="2026-10-19T19:09:00Z" w16du:dateUtc="2026-10-19T18:09:00Z">
             <w:rPr>
               <w:i/>
@@ -1211,25 +1220,19 @@
             </w:rPr>
           </w:rPrChange>
         </w:rPr>
-      </w:pPr>
-      <w:r>
+        <w:t>25/10/2026</w:t>
+      </w:r>
+    </w:p>
+    <w:p>
+      <w:pPr>
         <w:rPr>
           <w:rFonts w:ascii="Times New Roman" w:hAnsi="Times New Roman" w:cs="Times New Roman"/>
           <w:i/>
           <w:color w:val="156082"/>
           <w:sz w:val="32"/>
           <w:szCs w:val="32"/>
-          <w:rPrChange w:id="51" w:author="Nicolas Cancino" w:date="2026-10-19T19:09:00Z" w16du:dateUtc="2026-10-19T18:09:00Z">
-            <w:rPr>
-              <w:i/>
-              <w:color w:val="156082"/>
-              <w:sz w:val="32"/>
-              <w:szCs w:val="32"/>
-            </w:rPr>
-          </w:rPrChange>
-        </w:rPr>
-        <w:t>25/10/2026</w:t>
-      </w:r>
+        </w:rPr>
+      </w:pPr>
     </w:p>
     <w:p>
       <w:pPr>
@@ -1239,14 +1242,172 @@
           <w:color w:val="156082"/>
           <w:sz w:val="32"/>
           <w:szCs w:val="32"/>
-          <w:rPrChange w:id="52" w:author="Nicolas Cancino" w:date="2026-10-19T19:09:00Z" w16du:dateUtc="2026-10-19T18:09:00Z">
-            <w:rPr>
-              <w:i/>
-              <w:color w:val="156082"/>
-              <w:sz w:val="32"/>
-              <w:szCs w:val="32"/>
-            </w:rPr>
-          </w:rPrChange>
+        </w:rPr>
+      </w:pPr>
+    </w:p>
+    <w:p>
+      <w:pPr>
+        <w:rPr>
+          <w:rFonts w:ascii="Times New Roman" w:hAnsi="Times New Roman" w:cs="Times New Roman"/>
+          <w:i/>
+          <w:color w:val="156082"/>
+          <w:sz w:val="32"/>
+          <w:szCs w:val="32"/>
+        </w:rPr>
+      </w:pPr>
+    </w:p>
+    <w:p>
+      <w:pPr>
+        <w:rPr>
+          <w:rFonts w:ascii="Times New Roman" w:hAnsi="Times New Roman" w:cs="Times New Roman"/>
+          <w:i/>
+          <w:color w:val="156082"/>
+          <w:sz w:val="32"/>
+          <w:szCs w:val="32"/>
+        </w:rPr>
+      </w:pPr>
+    </w:p>
+    <w:p>
+      <w:pPr>
+        <w:rPr>
+          <w:rFonts w:ascii="Times New Roman" w:hAnsi="Times New Roman" w:cs="Times New Roman"/>
+          <w:i/>
+          <w:color w:val="156082"/>
+          <w:sz w:val="32"/>
+          <w:szCs w:val="32"/>
+        </w:rPr>
+      </w:pPr>
+    </w:p>
+    <w:p>
+      <w:pPr>
+        <w:rPr>
+          <w:rFonts w:ascii="Times New Roman" w:hAnsi="Times New Roman" w:cs="Times New Roman"/>
+          <w:i/>
+          <w:color w:val="156082"/>
+          <w:sz w:val="32"/>
+          <w:szCs w:val="32"/>
+        </w:rPr>
+      </w:pPr>
+    </w:p>
+    <w:p>
+      <w:pPr>
+        <w:rPr>
+          <w:rFonts w:ascii="Times New Roman" w:hAnsi="Times New Roman" w:cs="Times New Roman"/>
+          <w:i/>
+          <w:color w:val="156082"/>
+          <w:sz w:val="32"/>
+          <w:szCs w:val="32"/>
+        </w:rPr>
+      </w:pPr>
+    </w:p>
+    <w:p>
+      <w:pPr>
+        <w:rPr>
+          <w:rFonts w:ascii="Times New Roman" w:hAnsi="Times New Roman" w:cs="Times New Roman"/>
+          <w:i/>
+          <w:color w:val="156082"/>
+          <w:sz w:val="32"/>
+          <w:szCs w:val="32"/>
+        </w:rPr>
+      </w:pPr>
+    </w:p>
+    <w:p>
+      <w:pPr>
+        <w:rPr>
+          <w:rFonts w:ascii="Times New Roman" w:hAnsi="Times New Roman" w:cs="Times New Roman"/>
+          <w:i/>
+          <w:color w:val="156082"/>
+          <w:sz w:val="32"/>
+          <w:szCs w:val="32"/>
+        </w:rPr>
+      </w:pPr>
+    </w:p>
+    <w:p>
+      <w:pPr>
+        <w:rPr>
+          <w:rFonts w:ascii="Times New Roman" w:hAnsi="Times New Roman" w:cs="Times New Roman"/>
+          <w:i/>
+          <w:color w:val="156082"/>
+          <w:sz w:val="32"/>
+          <w:szCs w:val="32"/>
+        </w:rPr>
+      </w:pPr>
+    </w:p>
+    <w:p>
+      <w:pPr>
+        <w:rPr>
+          <w:rFonts w:ascii="Times New Roman" w:hAnsi="Times New Roman" w:cs="Times New Roman"/>
+          <w:i/>
+          <w:color w:val="156082"/>
+          <w:sz w:val="32"/>
+          <w:szCs w:val="32"/>
+        </w:rPr>
+      </w:pPr>
+    </w:p>
+    <w:p>
+      <w:pPr>
+        <w:rPr>
+          <w:rFonts w:ascii="Times New Roman" w:hAnsi="Times New Roman" w:cs="Times New Roman"/>
+          <w:i/>
+          <w:color w:val="156082"/>
+          <w:sz w:val="32"/>
+          <w:szCs w:val="32"/>
+        </w:rPr>
+      </w:pPr>
+    </w:p>
+    <w:p>
+      <w:pPr>
+        <w:rPr>
+          <w:rFonts w:ascii="Times New Roman" w:hAnsi="Times New Roman" w:cs="Times New Roman"/>
+          <w:i/>
+          <w:color w:val="156082"/>
+          <w:sz w:val="32"/>
+          <w:szCs w:val="32"/>
+        </w:rPr>
+      </w:pPr>
+    </w:p>
+    <w:p>
+      <w:pPr>
+        <w:rPr>
+          <w:rFonts w:ascii="Times New Roman" w:hAnsi="Times New Roman" w:cs="Times New Roman"/>
+          <w:i/>
+          <w:color w:val="156082"/>
+          <w:sz w:val="32"/>
+          <w:szCs w:val="32"/>
+        </w:rPr>
+      </w:pPr>
+    </w:p>
+    <w:p>
+      <w:pPr>
+        <w:rPr>
+          <w:rFonts w:ascii="Times New Roman" w:hAnsi="Times New Roman" w:cs="Times New Roman"/>
+          <w:i/>
+          <w:color w:val="156082"/>
+          <w:sz w:val="32"/>
+          <w:szCs w:val="32"/>
+        </w:rPr>
+      </w:pPr>
+    </w:p>
+    <w:p>
+      <w:pPr>
+        <w:rPr>
+          <w:rFonts w:ascii="Times New Roman" w:hAnsi="Times New Roman" w:cs="Times New Roman"/>
+          <w:i/>
+          <w:color w:val="156082"/>
+          <w:sz w:val="32"/>
+          <w:szCs w:val="32"/>
+        </w:rPr>
+      </w:pPr>
+    </w:p>
+    <w:p>
+      <w:pPr>
+        <w:rPr>
+          <w:ins w:id="51" w:author="Nicolas Cancino" w:date="2026-10-19T19:10:00Z" w16du:dateUtc="2026-10-19T18:10:00Z"/>
+          <w:rFonts w:ascii="Times New Roman" w:hAnsi="Times New Roman" w:cs="Times New Roman"/>
+          <w:i/>
+          <w:color w:val="156082"/>
+          <w:sz w:val="32"/>
+          <w:szCs w:val="32"/>
         </w:rPr>
       </w:pPr>
     </w:p>
@@ -1254,7 +1415,7 @@
       <w:pPr>
         <w:jc w:val="center"/>
         <w:rPr>
-          <w:ins w:id="53" w:author="Nicolas Cancino" w:date="2026-10-19T19:09:00Z" w16du:dateUtc="2026-10-19T18:09:00Z"/>
+          <w:ins w:id="52" w:author="Nicolas Cancino" w:date="2026-10-19T19:10:00Z" w16du:dateUtc="2026-10-19T18:10:00Z"/>
           <w:rFonts w:ascii="Times New Roman" w:hAnsi="Times New Roman" w:cs="Times New Roman"/>
           <w:i/>
           <w:color w:val="000000" w:themeColor="text1"/>
@@ -1264,11 +1425,1672 @@
         </w:rPr>
       </w:pPr>
     </w:p>
+    <w:sdt>
+      <w:sdtPr>
+        <w:rPr>
+          <w:b/>
+          <w:bCs/>
+        </w:rPr>
+        <w:id w:val="176170448"/>
+        <w:docPartObj>
+          <w:docPartGallery w:val="Table of Contents"/>
+          <w:docPartUnique/>
+        </w:docPartObj>
+      </w:sdtPr>
+      <w:sdtEndPr>
+        <w:rPr>
+          <w:rFonts w:ascii="Calibri" w:eastAsia="Calibri" w:hAnsi="Calibri" w:cs="Calibri"/>
+          <w:color w:val="auto"/>
+          <w:sz w:val="22"/>
+          <w:szCs w:val="22"/>
+          <w:lang w:val="en-IE" w:eastAsia="en-IE"/>
+        </w:rPr>
+      </w:sdtEndPr>
+      <w:sdtContent>
+        <w:p>
+          <w:pPr>
+            <w:pStyle w:val="TOCHeading"/>
+            <w:tabs>
+              <w:tab w:val="left" w:pos="4788"/>
+            </w:tabs>
+            <w:rPr>
+              <w:b/>
+              <w:bCs/>
+            </w:rPr>
+          </w:pPr>
+          <w:r>
+            <w:rPr>
+              <w:b/>
+              <w:bCs/>
+            </w:rPr>
+            <w:tab/>
+          </w:r>
+        </w:p>
+        <w:p>
+          <w:pPr>
+            <w:pStyle w:val="TOC1"/>
+            <w:rPr>
+              <w:b/>
+              <w:bCs/>
+            </w:rPr>
+          </w:pPr>
+        </w:p>
+        <w:p>
+          <w:pPr>
+            <w:pStyle w:val="TOC1"/>
+            <w:rPr>
+              <w:b/>
+              <w:bCs/>
+            </w:rPr>
+          </w:pPr>
+          <w:r>
+            <w:rPr>
+              <w:b/>
+              <w:bCs/>
+            </w:rPr>
+            <w:t>Table of Contents</w:t>
+          </w:r>
+        </w:p>
+        <w:p>
+          <w:pPr>
+            <w:rPr>
+              <w:b/>
+              <w:bCs/>
+            </w:rPr>
+          </w:pPr>
+        </w:p>
+        <w:p>
+          <w:pPr>
+            <w:pStyle w:val="TOC1"/>
+            <w:rPr>
+              <w:rFonts w:asciiTheme="minorHAnsi" w:eastAsiaTheme="minorEastAsia" w:hAnsiTheme="minorHAnsi" w:cstheme="minorBidi"/>
+              <w:b/>
+              <w:bCs/>
+              <w:noProof/>
+              <w:kern w:val="2"/>
+              <w:sz w:val="24"/>
+              <w:szCs w:val="24"/>
+              <w:lang w:val="en-GB" w:eastAsia="en-GB"/>
+              <w14:ligatures w14:val="standardContextual"/>
+            </w:rPr>
+          </w:pPr>
+          <w:r>
+            <w:rPr>
+              <w:b/>
+              <w:bCs/>
+            </w:rPr>
+            <w:fldChar w:fldCharType="begin"/>
+          </w:r>
+          <w:r>
+            <w:rPr>
+              <w:b/>
+              <w:bCs/>
+            </w:rPr>
+            <w:instrText xml:space="preserve"> TOC \o "1-3" \h \z \u </w:instrText>
+          </w:r>
+          <w:r>
+            <w:rPr>
+              <w:b/>
+              <w:bCs/>
+            </w:rPr>
+            <w:fldChar w:fldCharType="separate"/>
+          </w:r>
+          <w:hyperlink w:anchor="_Toc243561951" w:history="1">
+            <w:r>
+              <w:rPr>
+                <w:rStyle w:val="Hyperlink"/>
+                <w:b/>
+                <w:bCs/>
+                <w:noProof/>
+                <w:sz w:val="22"/>
+                <w:szCs w:val="22"/>
+                <w14:textOutline w14:w="9525" w14:cap="rnd" w14:cmpd="sng" w14:algn="ctr">
+                  <w14:noFill/>
+                  <w14:prstDash w14:val="solid"/>
+                  <w14:bevel/>
+                </w14:textOutline>
+              </w:rPr>
+              <w:t>Demographic Patterns and Health Impacts of Air Pollution in New York City: A Data Analytics Approach</w:t>
+            </w:r>
+            <w:r>
+              <w:rPr>
+                <w:b/>
+                <w:bCs/>
+                <w:noProof/>
+                <w:webHidden/>
+              </w:rPr>
+              <w:tab/>
+            </w:r>
+            <w:r>
+              <w:rPr>
+                <w:b/>
+                <w:bCs/>
+                <w:noProof/>
+                <w:webHidden/>
+              </w:rPr>
+              <w:fldChar w:fldCharType="begin"/>
+            </w:r>
+            <w:r>
+              <w:rPr>
+                <w:b/>
+                <w:bCs/>
+                <w:noProof/>
+                <w:webHidden/>
+              </w:rPr>
+              <w:instrText xml:space="preserve"> PAGEREF _Toc243561951 \h </w:instrText>
+            </w:r>
+            <w:r>
+              <w:rPr>
+                <w:b/>
+                <w:bCs/>
+                <w:noProof/>
+                <w:webHidden/>
+              </w:rPr>
+            </w:r>
+            <w:r>
+              <w:rPr>
+                <w:b/>
+                <w:bCs/>
+                <w:noProof/>
+                <w:webHidden/>
+              </w:rPr>
+              <w:fldChar w:fldCharType="separate"/>
+            </w:r>
+            <w:r>
+              <w:rPr>
+                <w:b/>
+                <w:bCs/>
+                <w:noProof/>
+                <w:webHidden/>
+              </w:rPr>
+              <w:t>4</w:t>
+            </w:r>
+            <w:r>
+              <w:rPr>
+                <w:b/>
+                <w:bCs/>
+                <w:noProof/>
+                <w:webHidden/>
+              </w:rPr>
+              <w:fldChar w:fldCharType="end"/>
+            </w:r>
+          </w:hyperlink>
+        </w:p>
+        <w:p>
+          <w:pPr>
+            <w:pStyle w:val="TOC2"/>
+            <w:tabs>
+              <w:tab w:val="right" w:leader="dot" w:pos="8494"/>
+            </w:tabs>
+            <w:rPr>
+              <w:rFonts w:asciiTheme="minorHAnsi" w:eastAsiaTheme="minorEastAsia" w:hAnsiTheme="minorHAnsi" w:cstheme="minorBidi"/>
+              <w:b/>
+              <w:bCs/>
+              <w:noProof/>
+              <w:kern w:val="2"/>
+              <w:sz w:val="24"/>
+              <w:szCs w:val="24"/>
+              <w:lang w:val="en-GB" w:eastAsia="en-GB"/>
+              <w14:ligatures w14:val="standardContextual"/>
+            </w:rPr>
+          </w:pPr>
+          <w:hyperlink w:anchor="_Toc243561952" w:history="1">
+            <w:r>
+              <w:rPr>
+                <w:rStyle w:val="Hyperlink"/>
+                <w:rFonts w:ascii="Times New Roman" w:hAnsi="Times New Roman" w:cs="Times New Roman"/>
+                <w:b/>
+                <w:bCs/>
+                <w:i/>
+                <w:iCs/>
+                <w:noProof/>
+                <w:lang w:val="en-GB"/>
+              </w:rPr>
+              <w:t>Introduction</w:t>
+            </w:r>
+            <w:r>
+              <w:rPr>
+                <w:b/>
+                <w:bCs/>
+                <w:noProof/>
+                <w:webHidden/>
+              </w:rPr>
+              <w:tab/>
+            </w:r>
+            <w:r>
+              <w:rPr>
+                <w:b/>
+                <w:bCs/>
+                <w:noProof/>
+                <w:webHidden/>
+              </w:rPr>
+              <w:fldChar w:fldCharType="begin"/>
+            </w:r>
+            <w:r>
+              <w:rPr>
+                <w:b/>
+                <w:bCs/>
+                <w:noProof/>
+                <w:webHidden/>
+              </w:rPr>
+              <w:instrText xml:space="preserve"> PAGEREF _Toc243561952 \h </w:instrText>
+            </w:r>
+            <w:r>
+              <w:rPr>
+                <w:b/>
+                <w:bCs/>
+                <w:noProof/>
+                <w:webHidden/>
+              </w:rPr>
+            </w:r>
+            <w:r>
+              <w:rPr>
+                <w:b/>
+                <w:bCs/>
+                <w:noProof/>
+                <w:webHidden/>
+              </w:rPr>
+              <w:fldChar w:fldCharType="separate"/>
+            </w:r>
+            <w:r>
+              <w:rPr>
+                <w:b/>
+                <w:bCs/>
+                <w:noProof/>
+                <w:webHidden/>
+              </w:rPr>
+              <w:t>4</w:t>
+            </w:r>
+            <w:r>
+              <w:rPr>
+                <w:b/>
+                <w:bCs/>
+                <w:noProof/>
+                <w:webHidden/>
+              </w:rPr>
+              <w:fldChar w:fldCharType="end"/>
+            </w:r>
+          </w:hyperlink>
+        </w:p>
+        <w:p>
+          <w:pPr>
+            <w:pStyle w:val="TOC2"/>
+            <w:tabs>
+              <w:tab w:val="right" w:leader="dot" w:pos="8494"/>
+            </w:tabs>
+            <w:rPr>
+              <w:rFonts w:asciiTheme="minorHAnsi" w:eastAsiaTheme="minorEastAsia" w:hAnsiTheme="minorHAnsi" w:cstheme="minorBidi"/>
+              <w:b/>
+              <w:bCs/>
+              <w:noProof/>
+              <w:kern w:val="2"/>
+              <w:sz w:val="24"/>
+              <w:szCs w:val="24"/>
+              <w:lang w:val="en-GB" w:eastAsia="en-GB"/>
+              <w14:ligatures w14:val="standardContextual"/>
+            </w:rPr>
+          </w:pPr>
+          <w:hyperlink w:anchor="_Toc243561953" w:history="1">
+            <w:r>
+              <w:rPr>
+                <w:rStyle w:val="Hyperlink"/>
+                <w:rFonts w:ascii="Times New Roman" w:hAnsi="Times New Roman" w:cs="Times New Roman"/>
+                <w:b/>
+                <w:bCs/>
+                <w:i/>
+                <w:noProof/>
+                <w:lang w:val="en-GB"/>
+              </w:rPr>
+              <w:t>Problem Definition</w:t>
+            </w:r>
+            <w:r>
+              <w:rPr>
+                <w:b/>
+                <w:bCs/>
+                <w:noProof/>
+                <w:webHidden/>
+              </w:rPr>
+              <w:tab/>
+            </w:r>
+            <w:r>
+              <w:rPr>
+                <w:b/>
+                <w:bCs/>
+                <w:noProof/>
+                <w:webHidden/>
+              </w:rPr>
+              <w:fldChar w:fldCharType="begin"/>
+            </w:r>
+            <w:r>
+              <w:rPr>
+                <w:b/>
+                <w:bCs/>
+                <w:noProof/>
+                <w:webHidden/>
+              </w:rPr>
+              <w:instrText xml:space="preserve"> PAGEREF _Toc243561953 \h </w:instrText>
+            </w:r>
+            <w:r>
+              <w:rPr>
+                <w:b/>
+                <w:bCs/>
+                <w:noProof/>
+                <w:webHidden/>
+              </w:rPr>
+            </w:r>
+            <w:r>
+              <w:rPr>
+                <w:b/>
+                <w:bCs/>
+                <w:noProof/>
+                <w:webHidden/>
+              </w:rPr>
+              <w:fldChar w:fldCharType="separate"/>
+            </w:r>
+            <w:r>
+              <w:rPr>
+                <w:b/>
+                <w:bCs/>
+                <w:noProof/>
+                <w:webHidden/>
+              </w:rPr>
+              <w:t>4</w:t>
+            </w:r>
+            <w:r>
+              <w:rPr>
+                <w:b/>
+                <w:bCs/>
+                <w:noProof/>
+                <w:webHidden/>
+              </w:rPr>
+              <w:fldChar w:fldCharType="end"/>
+            </w:r>
+          </w:hyperlink>
+        </w:p>
+        <w:p>
+          <w:pPr>
+            <w:pStyle w:val="TOC2"/>
+            <w:tabs>
+              <w:tab w:val="right" w:leader="dot" w:pos="8494"/>
+            </w:tabs>
+            <w:rPr>
+              <w:rFonts w:asciiTheme="minorHAnsi" w:eastAsiaTheme="minorEastAsia" w:hAnsiTheme="minorHAnsi" w:cstheme="minorBidi"/>
+              <w:b/>
+              <w:bCs/>
+              <w:noProof/>
+              <w:kern w:val="2"/>
+              <w:sz w:val="24"/>
+              <w:szCs w:val="24"/>
+              <w:lang w:val="en-GB" w:eastAsia="en-GB"/>
+              <w14:ligatures w14:val="standardContextual"/>
+            </w:rPr>
+          </w:pPr>
+          <w:hyperlink w:anchor="_Toc243561954" w:history="1">
+            <w:r>
+              <w:rPr>
+                <w:rStyle w:val="Hyperlink"/>
+                <w:rFonts w:ascii="Times New Roman" w:hAnsi="Times New Roman" w:cs="Times New Roman"/>
+                <w:b/>
+                <w:bCs/>
+                <w:i/>
+                <w:iCs/>
+                <w:noProof/>
+                <w:lang w:val="en-GB"/>
+              </w:rPr>
+              <w:t>Aim and Objectives</w:t>
+            </w:r>
+            <w:r>
+              <w:rPr>
+                <w:b/>
+                <w:bCs/>
+                <w:noProof/>
+                <w:webHidden/>
+              </w:rPr>
+              <w:tab/>
+            </w:r>
+            <w:r>
+              <w:rPr>
+                <w:b/>
+                <w:bCs/>
+                <w:noProof/>
+                <w:webHidden/>
+              </w:rPr>
+              <w:fldChar w:fldCharType="begin"/>
+            </w:r>
+            <w:r>
+              <w:rPr>
+                <w:b/>
+                <w:bCs/>
+                <w:noProof/>
+                <w:webHidden/>
+              </w:rPr>
+              <w:instrText xml:space="preserve"> PAGEREF _Toc243561954 \h </w:instrText>
+            </w:r>
+            <w:r>
+              <w:rPr>
+                <w:b/>
+                <w:bCs/>
+                <w:noProof/>
+                <w:webHidden/>
+              </w:rPr>
+            </w:r>
+            <w:r>
+              <w:rPr>
+                <w:b/>
+                <w:bCs/>
+                <w:noProof/>
+                <w:webHidden/>
+              </w:rPr>
+              <w:fldChar w:fldCharType="separate"/>
+            </w:r>
+            <w:r>
+              <w:rPr>
+                <w:b/>
+                <w:bCs/>
+                <w:noProof/>
+                <w:webHidden/>
+              </w:rPr>
+              <w:t>4</w:t>
+            </w:r>
+            <w:r>
+              <w:rPr>
+                <w:b/>
+                <w:bCs/>
+                <w:noProof/>
+                <w:webHidden/>
+              </w:rPr>
+              <w:fldChar w:fldCharType="end"/>
+            </w:r>
+          </w:hyperlink>
+        </w:p>
+        <w:p>
+          <w:pPr>
+            <w:pStyle w:val="TOC2"/>
+            <w:tabs>
+              <w:tab w:val="right" w:leader="dot" w:pos="8494"/>
+            </w:tabs>
+            <w:rPr>
+              <w:rFonts w:asciiTheme="minorHAnsi" w:eastAsiaTheme="minorEastAsia" w:hAnsiTheme="minorHAnsi" w:cstheme="minorBidi"/>
+              <w:b/>
+              <w:bCs/>
+              <w:noProof/>
+              <w:kern w:val="2"/>
+              <w:sz w:val="24"/>
+              <w:szCs w:val="24"/>
+              <w:lang w:val="en-GB" w:eastAsia="en-GB"/>
+              <w14:ligatures w14:val="standardContextual"/>
+            </w:rPr>
+          </w:pPr>
+          <w:hyperlink w:anchor="_Toc243561955" w:history="1">
+            <w:r>
+              <w:rPr>
+                <w:rStyle w:val="Hyperlink"/>
+                <w:rFonts w:ascii="Times New Roman" w:hAnsi="Times New Roman" w:cs="Times New Roman"/>
+                <w:b/>
+                <w:bCs/>
+                <w:i/>
+                <w:iCs/>
+                <w:noProof/>
+                <w:lang w:val="en-GB"/>
+              </w:rPr>
+              <w:t>Scope</w:t>
+            </w:r>
+            <w:r>
+              <w:rPr>
+                <w:b/>
+                <w:bCs/>
+                <w:noProof/>
+                <w:webHidden/>
+              </w:rPr>
+              <w:tab/>
+            </w:r>
+            <w:r>
+              <w:rPr>
+                <w:b/>
+                <w:bCs/>
+                <w:noProof/>
+                <w:webHidden/>
+              </w:rPr>
+              <w:fldChar w:fldCharType="begin"/>
+            </w:r>
+            <w:r>
+              <w:rPr>
+                <w:b/>
+                <w:bCs/>
+                <w:noProof/>
+                <w:webHidden/>
+              </w:rPr>
+              <w:instrText xml:space="preserve"> PAGEREF _Toc243561955 \h </w:instrText>
+            </w:r>
+            <w:r>
+              <w:rPr>
+                <w:b/>
+                <w:bCs/>
+                <w:noProof/>
+                <w:webHidden/>
+              </w:rPr>
+            </w:r>
+            <w:r>
+              <w:rPr>
+                <w:b/>
+                <w:bCs/>
+                <w:noProof/>
+                <w:webHidden/>
+              </w:rPr>
+              <w:fldChar w:fldCharType="separate"/>
+            </w:r>
+            <w:r>
+              <w:rPr>
+                <w:b/>
+                <w:bCs/>
+                <w:noProof/>
+                <w:webHidden/>
+              </w:rPr>
+              <w:t>5</w:t>
+            </w:r>
+            <w:r>
+              <w:rPr>
+                <w:b/>
+                <w:bCs/>
+                <w:noProof/>
+                <w:webHidden/>
+              </w:rPr>
+              <w:fldChar w:fldCharType="end"/>
+            </w:r>
+          </w:hyperlink>
+        </w:p>
+        <w:p>
+          <w:pPr>
+            <w:pStyle w:val="TOC2"/>
+            <w:tabs>
+              <w:tab w:val="right" w:leader="dot" w:pos="8494"/>
+            </w:tabs>
+            <w:rPr>
+              <w:rFonts w:asciiTheme="minorHAnsi" w:eastAsiaTheme="minorEastAsia" w:hAnsiTheme="minorHAnsi" w:cstheme="minorBidi"/>
+              <w:b/>
+              <w:bCs/>
+              <w:noProof/>
+              <w:kern w:val="2"/>
+              <w:sz w:val="24"/>
+              <w:szCs w:val="24"/>
+              <w:lang w:val="en-GB" w:eastAsia="en-GB"/>
+              <w14:ligatures w14:val="standardContextual"/>
+            </w:rPr>
+          </w:pPr>
+          <w:hyperlink w:anchor="_Toc243561956" w:history="1">
+            <w:r>
+              <w:rPr>
+                <w:rStyle w:val="Hyperlink"/>
+                <w:rFonts w:ascii="Times New Roman" w:eastAsia="Times New Roman" w:hAnsi="Times New Roman" w:cs="Times New Roman"/>
+                <w:b/>
+                <w:bCs/>
+                <w:i/>
+                <w:iCs/>
+                <w:noProof/>
+                <w:lang w:val="en-GB" w:eastAsia="en-GB"/>
+              </w:rPr>
+              <w:t>Methodology</w:t>
+            </w:r>
+            <w:r>
+              <w:rPr>
+                <w:b/>
+                <w:bCs/>
+                <w:noProof/>
+                <w:webHidden/>
+              </w:rPr>
+              <w:tab/>
+            </w:r>
+            <w:r>
+              <w:rPr>
+                <w:b/>
+                <w:bCs/>
+                <w:noProof/>
+                <w:webHidden/>
+              </w:rPr>
+              <w:fldChar w:fldCharType="begin"/>
+            </w:r>
+            <w:r>
+              <w:rPr>
+                <w:b/>
+                <w:bCs/>
+                <w:noProof/>
+                <w:webHidden/>
+              </w:rPr>
+              <w:instrText xml:space="preserve"> PAGEREF _Toc243561956 \h </w:instrText>
+            </w:r>
+            <w:r>
+              <w:rPr>
+                <w:b/>
+                <w:bCs/>
+                <w:noProof/>
+                <w:webHidden/>
+              </w:rPr>
+            </w:r>
+            <w:r>
+              <w:rPr>
+                <w:b/>
+                <w:bCs/>
+                <w:noProof/>
+                <w:webHidden/>
+              </w:rPr>
+              <w:fldChar w:fldCharType="separate"/>
+            </w:r>
+            <w:r>
+              <w:rPr>
+                <w:b/>
+                <w:bCs/>
+                <w:noProof/>
+                <w:webHidden/>
+              </w:rPr>
+              <w:t>6</w:t>
+            </w:r>
+            <w:r>
+              <w:rPr>
+                <w:b/>
+                <w:bCs/>
+                <w:noProof/>
+                <w:webHidden/>
+              </w:rPr>
+              <w:fldChar w:fldCharType="end"/>
+            </w:r>
+          </w:hyperlink>
+        </w:p>
+        <w:p>
+          <w:pPr>
+            <w:pStyle w:val="TOC2"/>
+            <w:tabs>
+              <w:tab w:val="right" w:leader="dot" w:pos="8494"/>
+            </w:tabs>
+            <w:rPr>
+              <w:rFonts w:asciiTheme="minorHAnsi" w:eastAsiaTheme="minorEastAsia" w:hAnsiTheme="minorHAnsi" w:cstheme="minorBidi"/>
+              <w:b/>
+              <w:bCs/>
+              <w:noProof/>
+              <w:kern w:val="2"/>
+              <w:sz w:val="24"/>
+              <w:szCs w:val="24"/>
+              <w:lang w:val="en-GB" w:eastAsia="en-GB"/>
+              <w14:ligatures w14:val="standardContextual"/>
+            </w:rPr>
+          </w:pPr>
+          <w:hyperlink w:anchor="_Toc243561957" w:history="1">
+            <w:r>
+              <w:rPr>
+                <w:rStyle w:val="Hyperlink"/>
+                <w:rFonts w:ascii="Times New Roman" w:eastAsia="Times New Roman" w:hAnsi="Times New Roman" w:cs="Times New Roman"/>
+                <w:b/>
+                <w:bCs/>
+                <w:i/>
+                <w:iCs/>
+                <w:noProof/>
+                <w:lang w:val="en-GB" w:eastAsia="en-GB"/>
+              </w:rPr>
+              <w:t>Data Sources</w:t>
+            </w:r>
+            <w:r>
+              <w:rPr>
+                <w:b/>
+                <w:bCs/>
+                <w:noProof/>
+                <w:webHidden/>
+              </w:rPr>
+              <w:tab/>
+            </w:r>
+            <w:r>
+              <w:rPr>
+                <w:b/>
+                <w:bCs/>
+                <w:noProof/>
+                <w:webHidden/>
+              </w:rPr>
+              <w:fldChar w:fldCharType="begin"/>
+            </w:r>
+            <w:r>
+              <w:rPr>
+                <w:b/>
+                <w:bCs/>
+                <w:noProof/>
+                <w:webHidden/>
+              </w:rPr>
+              <w:instrText xml:space="preserve"> PAGEREF _Toc243561957 \h </w:instrText>
+            </w:r>
+            <w:r>
+              <w:rPr>
+                <w:b/>
+                <w:bCs/>
+                <w:noProof/>
+                <w:webHidden/>
+              </w:rPr>
+            </w:r>
+            <w:r>
+              <w:rPr>
+                <w:b/>
+                <w:bCs/>
+                <w:noProof/>
+                <w:webHidden/>
+              </w:rPr>
+              <w:fldChar w:fldCharType="separate"/>
+            </w:r>
+            <w:r>
+              <w:rPr>
+                <w:b/>
+                <w:bCs/>
+                <w:noProof/>
+                <w:webHidden/>
+              </w:rPr>
+              <w:t>6</w:t>
+            </w:r>
+            <w:r>
+              <w:rPr>
+                <w:b/>
+                <w:bCs/>
+                <w:noProof/>
+                <w:webHidden/>
+              </w:rPr>
+              <w:fldChar w:fldCharType="end"/>
+            </w:r>
+          </w:hyperlink>
+        </w:p>
+        <w:p>
+          <w:pPr>
+            <w:pStyle w:val="TOC2"/>
+            <w:tabs>
+              <w:tab w:val="right" w:leader="dot" w:pos="8494"/>
+            </w:tabs>
+            <w:rPr>
+              <w:rFonts w:asciiTheme="minorHAnsi" w:eastAsiaTheme="minorEastAsia" w:hAnsiTheme="minorHAnsi" w:cstheme="minorBidi"/>
+              <w:b/>
+              <w:bCs/>
+              <w:noProof/>
+              <w:kern w:val="2"/>
+              <w:sz w:val="24"/>
+              <w:szCs w:val="24"/>
+              <w:lang w:val="en-GB" w:eastAsia="en-GB"/>
+              <w14:ligatures w14:val="standardContextual"/>
+            </w:rPr>
+          </w:pPr>
+          <w:hyperlink w:anchor="_Toc243561958" w:history="1">
+            <w:r>
+              <w:rPr>
+                <w:rStyle w:val="Hyperlink"/>
+                <w:rFonts w:ascii="Times New Roman" w:eastAsia="Times New Roman" w:hAnsi="Times New Roman" w:cs="Times New Roman"/>
+                <w:b/>
+                <w:bCs/>
+                <w:i/>
+                <w:iCs/>
+                <w:noProof/>
+                <w:lang w:val="en-GB" w:eastAsia="en-GB"/>
+              </w:rPr>
+              <w:t>Expected Deliverables</w:t>
+            </w:r>
+            <w:r>
+              <w:rPr>
+                <w:b/>
+                <w:bCs/>
+                <w:noProof/>
+                <w:webHidden/>
+              </w:rPr>
+              <w:tab/>
+            </w:r>
+            <w:r>
+              <w:rPr>
+                <w:b/>
+                <w:bCs/>
+                <w:noProof/>
+                <w:webHidden/>
+              </w:rPr>
+              <w:fldChar w:fldCharType="begin"/>
+            </w:r>
+            <w:r>
+              <w:rPr>
+                <w:b/>
+                <w:bCs/>
+                <w:noProof/>
+                <w:webHidden/>
+              </w:rPr>
+              <w:instrText xml:space="preserve"> PAGEREF _Toc243561958 \h </w:instrText>
+            </w:r>
+            <w:r>
+              <w:rPr>
+                <w:b/>
+                <w:bCs/>
+                <w:noProof/>
+                <w:webHidden/>
+              </w:rPr>
+            </w:r>
+            <w:r>
+              <w:rPr>
+                <w:b/>
+                <w:bCs/>
+                <w:noProof/>
+                <w:webHidden/>
+              </w:rPr>
+              <w:fldChar w:fldCharType="separate"/>
+            </w:r>
+            <w:r>
+              <w:rPr>
+                <w:b/>
+                <w:bCs/>
+                <w:noProof/>
+                <w:webHidden/>
+              </w:rPr>
+              <w:t>7</w:t>
+            </w:r>
+            <w:r>
+              <w:rPr>
+                <w:b/>
+                <w:bCs/>
+                <w:noProof/>
+                <w:webHidden/>
+              </w:rPr>
+              <w:fldChar w:fldCharType="end"/>
+            </w:r>
+          </w:hyperlink>
+        </w:p>
+        <w:p>
+          <w:pPr>
+            <w:pStyle w:val="TOC2"/>
+            <w:tabs>
+              <w:tab w:val="right" w:leader="dot" w:pos="8494"/>
+            </w:tabs>
+            <w:rPr>
+              <w:rFonts w:asciiTheme="minorHAnsi" w:eastAsiaTheme="minorEastAsia" w:hAnsiTheme="minorHAnsi" w:cstheme="minorBidi"/>
+              <w:b/>
+              <w:bCs/>
+              <w:noProof/>
+              <w:kern w:val="2"/>
+              <w:sz w:val="24"/>
+              <w:szCs w:val="24"/>
+              <w:lang w:val="en-GB" w:eastAsia="en-GB"/>
+              <w14:ligatures w14:val="standardContextual"/>
+            </w:rPr>
+          </w:pPr>
+          <w:hyperlink w:anchor="_Toc243561959" w:history="1">
+            <w:r>
+              <w:rPr>
+                <w:rStyle w:val="Hyperlink"/>
+                <w:rFonts w:ascii="Times New Roman" w:hAnsi="Times New Roman" w:cs="Times New Roman"/>
+                <w:b/>
+                <w:bCs/>
+                <w:i/>
+                <w:iCs/>
+                <w:noProof/>
+                <w:lang w:val="en-GB"/>
+              </w:rPr>
+              <w:t>Project Timeline</w:t>
+            </w:r>
+            <w:r>
+              <w:rPr>
+                <w:b/>
+                <w:bCs/>
+                <w:noProof/>
+                <w:webHidden/>
+              </w:rPr>
+              <w:tab/>
+            </w:r>
+            <w:r>
+              <w:rPr>
+                <w:b/>
+                <w:bCs/>
+                <w:noProof/>
+                <w:webHidden/>
+              </w:rPr>
+              <w:fldChar w:fldCharType="begin"/>
+            </w:r>
+            <w:r>
+              <w:rPr>
+                <w:b/>
+                <w:bCs/>
+                <w:noProof/>
+                <w:webHidden/>
+              </w:rPr>
+              <w:instrText xml:space="preserve"> PAGEREF _Toc243561959 \h </w:instrText>
+            </w:r>
+            <w:r>
+              <w:rPr>
+                <w:b/>
+                <w:bCs/>
+                <w:noProof/>
+                <w:webHidden/>
+              </w:rPr>
+            </w:r>
+            <w:r>
+              <w:rPr>
+                <w:b/>
+                <w:bCs/>
+                <w:noProof/>
+                <w:webHidden/>
+              </w:rPr>
+              <w:fldChar w:fldCharType="separate"/>
+            </w:r>
+            <w:r>
+              <w:rPr>
+                <w:b/>
+                <w:bCs/>
+                <w:noProof/>
+                <w:webHidden/>
+              </w:rPr>
+              <w:t>7</w:t>
+            </w:r>
+            <w:r>
+              <w:rPr>
+                <w:b/>
+                <w:bCs/>
+                <w:noProof/>
+                <w:webHidden/>
+              </w:rPr>
+              <w:fldChar w:fldCharType="end"/>
+            </w:r>
+          </w:hyperlink>
+        </w:p>
+        <w:p>
+          <w:pPr>
+            <w:pStyle w:val="TOC2"/>
+            <w:tabs>
+              <w:tab w:val="right" w:leader="dot" w:pos="8494"/>
+            </w:tabs>
+            <w:rPr>
+              <w:rFonts w:asciiTheme="minorHAnsi" w:eastAsiaTheme="minorEastAsia" w:hAnsiTheme="minorHAnsi" w:cstheme="minorBidi"/>
+              <w:b/>
+              <w:bCs/>
+              <w:noProof/>
+              <w:kern w:val="2"/>
+              <w:sz w:val="24"/>
+              <w:szCs w:val="24"/>
+              <w:lang w:val="en-GB" w:eastAsia="en-GB"/>
+              <w14:ligatures w14:val="standardContextual"/>
+            </w:rPr>
+          </w:pPr>
+          <w:hyperlink w:anchor="_Toc243561960" w:history="1">
+            <w:r>
+              <w:rPr>
+                <w:rStyle w:val="Hyperlink"/>
+                <w:rFonts w:ascii="Times New Roman" w:hAnsi="Times New Roman" w:cs="Times New Roman"/>
+                <w:b/>
+                <w:bCs/>
+                <w:i/>
+                <w:iCs/>
+                <w:noProof/>
+              </w:rPr>
+              <w:t>Ethical and Legal Considerations</w:t>
+            </w:r>
+            <w:r>
+              <w:rPr>
+                <w:b/>
+                <w:bCs/>
+                <w:noProof/>
+                <w:webHidden/>
+              </w:rPr>
+              <w:tab/>
+            </w:r>
+            <w:r>
+              <w:rPr>
+                <w:b/>
+                <w:bCs/>
+                <w:noProof/>
+                <w:webHidden/>
+              </w:rPr>
+              <w:fldChar w:fldCharType="begin"/>
+            </w:r>
+            <w:r>
+              <w:rPr>
+                <w:b/>
+                <w:bCs/>
+                <w:noProof/>
+                <w:webHidden/>
+              </w:rPr>
+              <w:instrText xml:space="preserve"> PAGEREF _Toc243561960 \h </w:instrText>
+            </w:r>
+            <w:r>
+              <w:rPr>
+                <w:b/>
+                <w:bCs/>
+                <w:noProof/>
+                <w:webHidden/>
+              </w:rPr>
+            </w:r>
+            <w:r>
+              <w:rPr>
+                <w:b/>
+                <w:bCs/>
+                <w:noProof/>
+                <w:webHidden/>
+              </w:rPr>
+              <w:fldChar w:fldCharType="separate"/>
+            </w:r>
+            <w:r>
+              <w:rPr>
+                <w:b/>
+                <w:bCs/>
+                <w:noProof/>
+                <w:webHidden/>
+              </w:rPr>
+              <w:t>9</w:t>
+            </w:r>
+            <w:r>
+              <w:rPr>
+                <w:b/>
+                <w:bCs/>
+                <w:noProof/>
+                <w:webHidden/>
+              </w:rPr>
+              <w:fldChar w:fldCharType="end"/>
+            </w:r>
+          </w:hyperlink>
+        </w:p>
+        <w:p>
+          <w:pPr>
+            <w:pStyle w:val="TOC2"/>
+            <w:tabs>
+              <w:tab w:val="right" w:leader="dot" w:pos="8494"/>
+            </w:tabs>
+            <w:rPr>
+              <w:rFonts w:asciiTheme="minorHAnsi" w:eastAsiaTheme="minorEastAsia" w:hAnsiTheme="minorHAnsi" w:cstheme="minorBidi"/>
+              <w:b/>
+              <w:bCs/>
+              <w:noProof/>
+              <w:kern w:val="2"/>
+              <w:sz w:val="24"/>
+              <w:szCs w:val="24"/>
+              <w:lang w:val="en-GB" w:eastAsia="en-GB"/>
+              <w14:ligatures w14:val="standardContextual"/>
+            </w:rPr>
+          </w:pPr>
+          <w:hyperlink w:anchor="_Toc243561961" w:history="1">
+            <w:r>
+              <w:rPr>
+                <w:rStyle w:val="Hyperlink"/>
+                <w:rFonts w:ascii="Times New Roman" w:hAnsi="Times New Roman" w:cs="Times New Roman"/>
+                <w:b/>
+                <w:bCs/>
+                <w:i/>
+                <w:iCs/>
+                <w:noProof/>
+              </w:rPr>
+              <w:t>Use of AI Tools</w:t>
+            </w:r>
+            <w:r>
+              <w:rPr>
+                <w:b/>
+                <w:bCs/>
+                <w:noProof/>
+                <w:webHidden/>
+              </w:rPr>
+              <w:tab/>
+            </w:r>
+            <w:r>
+              <w:rPr>
+                <w:b/>
+                <w:bCs/>
+                <w:noProof/>
+                <w:webHidden/>
+              </w:rPr>
+              <w:fldChar w:fldCharType="begin"/>
+            </w:r>
+            <w:r>
+              <w:rPr>
+                <w:b/>
+                <w:bCs/>
+                <w:noProof/>
+                <w:webHidden/>
+              </w:rPr>
+              <w:instrText xml:space="preserve"> PAGEREF _Toc243561961 \h </w:instrText>
+            </w:r>
+            <w:r>
+              <w:rPr>
+                <w:b/>
+                <w:bCs/>
+                <w:noProof/>
+                <w:webHidden/>
+              </w:rPr>
+            </w:r>
+            <w:r>
+              <w:rPr>
+                <w:b/>
+                <w:bCs/>
+                <w:noProof/>
+                <w:webHidden/>
+              </w:rPr>
+              <w:fldChar w:fldCharType="separate"/>
+            </w:r>
+            <w:r>
+              <w:rPr>
+                <w:b/>
+                <w:bCs/>
+                <w:noProof/>
+                <w:webHidden/>
+              </w:rPr>
+              <w:t>9</w:t>
+            </w:r>
+            <w:r>
+              <w:rPr>
+                <w:b/>
+                <w:bCs/>
+                <w:noProof/>
+                <w:webHidden/>
+              </w:rPr>
+              <w:fldChar w:fldCharType="end"/>
+            </w:r>
+          </w:hyperlink>
+        </w:p>
+        <w:p>
+          <w:pPr>
+            <w:pStyle w:val="TOC3"/>
+            <w:tabs>
+              <w:tab w:val="right" w:leader="dot" w:pos="8494"/>
+            </w:tabs>
+            <w:rPr>
+              <w:b/>
+              <w:bCs/>
+              <w:noProof/>
+            </w:rPr>
+          </w:pPr>
+          <w:hyperlink w:anchor="_Toc243561962" w:history="1">
+            <w:r>
+              <w:rPr>
+                <w:rStyle w:val="Hyperlink"/>
+                <w:rFonts w:ascii="Times New Roman" w:hAnsi="Times New Roman" w:cs="Times New Roman"/>
+                <w:b/>
+                <w:bCs/>
+                <w:i/>
+                <w:iCs/>
+                <w:noProof/>
+                <w:lang w:val="en-GB"/>
+              </w:rPr>
+              <w:t>F</w:t>
+            </w:r>
+            <w:r>
+              <w:rPr>
+                <w:rStyle w:val="Hyperlink"/>
+                <w:rFonts w:ascii="Times New Roman" w:hAnsi="Times New Roman" w:cs="Times New Roman"/>
+                <w:b/>
+                <w:bCs/>
+                <w:i/>
+                <w:iCs/>
+                <w:noProof/>
+                <w:lang w:val="en"/>
+              </w:rPr>
+              <w:t>irst use of AI</w:t>
+            </w:r>
+            <w:r>
+              <w:rPr>
+                <w:b/>
+                <w:bCs/>
+                <w:noProof/>
+                <w:webHidden/>
+              </w:rPr>
+              <w:tab/>
+            </w:r>
+            <w:r>
+              <w:rPr>
+                <w:b/>
+                <w:bCs/>
+                <w:noProof/>
+                <w:webHidden/>
+              </w:rPr>
+              <w:fldChar w:fldCharType="begin"/>
+            </w:r>
+            <w:r>
+              <w:rPr>
+                <w:b/>
+                <w:bCs/>
+                <w:noProof/>
+                <w:webHidden/>
+              </w:rPr>
+              <w:instrText xml:space="preserve"> PAGEREF _Toc243561962 \h </w:instrText>
+            </w:r>
+            <w:r>
+              <w:rPr>
+                <w:b/>
+                <w:bCs/>
+                <w:noProof/>
+                <w:webHidden/>
+              </w:rPr>
+            </w:r>
+            <w:r>
+              <w:rPr>
+                <w:b/>
+                <w:bCs/>
+                <w:noProof/>
+                <w:webHidden/>
+              </w:rPr>
+              <w:fldChar w:fldCharType="separate"/>
+            </w:r>
+            <w:r>
+              <w:rPr>
+                <w:b/>
+                <w:bCs/>
+                <w:noProof/>
+                <w:webHidden/>
+              </w:rPr>
+              <w:t>10</w:t>
+            </w:r>
+            <w:r>
+              <w:rPr>
+                <w:b/>
+                <w:bCs/>
+                <w:noProof/>
+                <w:webHidden/>
+              </w:rPr>
+              <w:fldChar w:fldCharType="end"/>
+            </w:r>
+          </w:hyperlink>
+        </w:p>
+        <w:p>
+          <w:pPr>
+            <w:pStyle w:val="TOC3"/>
+            <w:tabs>
+              <w:tab w:val="right" w:leader="dot" w:pos="8494"/>
+            </w:tabs>
+            <w:rPr>
+              <w:b/>
+              <w:bCs/>
+              <w:noProof/>
+            </w:rPr>
+          </w:pPr>
+          <w:hyperlink w:anchor="_Toc243561963" w:history="1">
+            <w:r>
+              <w:rPr>
+                <w:rStyle w:val="Hyperlink"/>
+                <w:rFonts w:ascii="Times New Roman" w:hAnsi="Times New Roman" w:cs="Times New Roman"/>
+                <w:b/>
+                <w:bCs/>
+                <w:i/>
+                <w:iCs/>
+                <w:noProof/>
+                <w:lang w:val="en-GB"/>
+              </w:rPr>
+              <w:t>Second</w:t>
+            </w:r>
+            <w:r>
+              <w:rPr>
+                <w:rStyle w:val="Hyperlink"/>
+                <w:rFonts w:ascii="Times New Roman" w:hAnsi="Times New Roman" w:cs="Times New Roman"/>
+                <w:b/>
+                <w:bCs/>
+                <w:i/>
+                <w:iCs/>
+                <w:noProof/>
+                <w:lang w:val="en"/>
+              </w:rPr>
+              <w:t xml:space="preserve"> use of AI</w:t>
+            </w:r>
+            <w:r>
+              <w:rPr>
+                <w:b/>
+                <w:bCs/>
+                <w:noProof/>
+                <w:webHidden/>
+              </w:rPr>
+              <w:tab/>
+            </w:r>
+            <w:r>
+              <w:rPr>
+                <w:b/>
+                <w:bCs/>
+                <w:noProof/>
+                <w:webHidden/>
+              </w:rPr>
+              <w:fldChar w:fldCharType="begin"/>
+            </w:r>
+            <w:r>
+              <w:rPr>
+                <w:b/>
+                <w:bCs/>
+                <w:noProof/>
+                <w:webHidden/>
+              </w:rPr>
+              <w:instrText xml:space="preserve"> PAGEREF _Toc243561963 \h </w:instrText>
+            </w:r>
+            <w:r>
+              <w:rPr>
+                <w:b/>
+                <w:bCs/>
+                <w:noProof/>
+                <w:webHidden/>
+              </w:rPr>
+            </w:r>
+            <w:r>
+              <w:rPr>
+                <w:b/>
+                <w:bCs/>
+                <w:noProof/>
+                <w:webHidden/>
+              </w:rPr>
+              <w:fldChar w:fldCharType="separate"/>
+            </w:r>
+            <w:r>
+              <w:rPr>
+                <w:b/>
+                <w:bCs/>
+                <w:noProof/>
+                <w:webHidden/>
+              </w:rPr>
+              <w:t>17</w:t>
+            </w:r>
+            <w:r>
+              <w:rPr>
+                <w:b/>
+                <w:bCs/>
+                <w:noProof/>
+                <w:webHidden/>
+              </w:rPr>
+              <w:fldChar w:fldCharType="end"/>
+            </w:r>
+          </w:hyperlink>
+        </w:p>
+        <w:p>
+          <w:pPr>
+            <w:pStyle w:val="TOC3"/>
+            <w:tabs>
+              <w:tab w:val="right" w:leader="dot" w:pos="8494"/>
+            </w:tabs>
+            <w:rPr>
+              <w:b/>
+              <w:bCs/>
+              <w:noProof/>
+            </w:rPr>
+          </w:pPr>
+          <w:hyperlink w:anchor="_Toc243561964" w:history="1">
+            <w:r>
+              <w:rPr>
+                <w:rStyle w:val="Hyperlink"/>
+                <w:rFonts w:ascii="Times New Roman" w:hAnsi="Times New Roman" w:cs="Times New Roman"/>
+                <w:b/>
+                <w:bCs/>
+                <w:i/>
+                <w:iCs/>
+                <w:noProof/>
+                <w:lang w:val="en-GB"/>
+              </w:rPr>
+              <w:t>Third</w:t>
+            </w:r>
+            <w:r>
+              <w:rPr>
+                <w:rStyle w:val="Hyperlink"/>
+                <w:rFonts w:ascii="Times New Roman" w:hAnsi="Times New Roman" w:cs="Times New Roman"/>
+                <w:b/>
+                <w:bCs/>
+                <w:i/>
+                <w:iCs/>
+                <w:noProof/>
+                <w:lang w:val="en"/>
+              </w:rPr>
+              <w:t xml:space="preserve"> use of AI</w:t>
+            </w:r>
+            <w:r>
+              <w:rPr>
+                <w:b/>
+                <w:bCs/>
+                <w:noProof/>
+                <w:webHidden/>
+              </w:rPr>
+              <w:tab/>
+            </w:r>
+            <w:r>
+              <w:rPr>
+                <w:b/>
+                <w:bCs/>
+                <w:noProof/>
+                <w:webHidden/>
+              </w:rPr>
+              <w:fldChar w:fldCharType="begin"/>
+            </w:r>
+            <w:r>
+              <w:rPr>
+                <w:b/>
+                <w:bCs/>
+                <w:noProof/>
+                <w:webHidden/>
+              </w:rPr>
+              <w:instrText xml:space="preserve"> PAGEREF _Toc243561964 \h </w:instrText>
+            </w:r>
+            <w:r>
+              <w:rPr>
+                <w:b/>
+                <w:bCs/>
+                <w:noProof/>
+                <w:webHidden/>
+              </w:rPr>
+            </w:r>
+            <w:r>
+              <w:rPr>
+                <w:b/>
+                <w:bCs/>
+                <w:noProof/>
+                <w:webHidden/>
+              </w:rPr>
+              <w:fldChar w:fldCharType="separate"/>
+            </w:r>
+            <w:r>
+              <w:rPr>
+                <w:b/>
+                <w:bCs/>
+                <w:noProof/>
+                <w:webHidden/>
+              </w:rPr>
+              <w:t>19</w:t>
+            </w:r>
+            <w:r>
+              <w:rPr>
+                <w:b/>
+                <w:bCs/>
+                <w:noProof/>
+                <w:webHidden/>
+              </w:rPr>
+              <w:fldChar w:fldCharType="end"/>
+            </w:r>
+          </w:hyperlink>
+        </w:p>
+        <w:p>
+          <w:pPr>
+            <w:pStyle w:val="TOC3"/>
+            <w:tabs>
+              <w:tab w:val="right" w:leader="dot" w:pos="8494"/>
+            </w:tabs>
+            <w:rPr>
+              <w:b/>
+              <w:bCs/>
+              <w:noProof/>
+            </w:rPr>
+          </w:pPr>
+          <w:hyperlink w:anchor="_Toc243561965" w:history="1">
+            <w:r>
+              <w:rPr>
+                <w:rStyle w:val="Hyperlink"/>
+                <w:rFonts w:ascii="Times New Roman" w:hAnsi="Times New Roman" w:cs="Times New Roman"/>
+                <w:b/>
+                <w:bCs/>
+                <w:i/>
+                <w:iCs/>
+                <w:noProof/>
+                <w:lang w:val="en-GB"/>
+              </w:rPr>
+              <w:t>Fourth use of IA</w:t>
+            </w:r>
+            <w:r>
+              <w:rPr>
+                <w:b/>
+                <w:bCs/>
+                <w:noProof/>
+                <w:webHidden/>
+              </w:rPr>
+              <w:tab/>
+            </w:r>
+            <w:r>
+              <w:rPr>
+                <w:b/>
+                <w:bCs/>
+                <w:noProof/>
+                <w:webHidden/>
+              </w:rPr>
+              <w:fldChar w:fldCharType="begin"/>
+            </w:r>
+            <w:r>
+              <w:rPr>
+                <w:b/>
+                <w:bCs/>
+                <w:noProof/>
+                <w:webHidden/>
+              </w:rPr>
+              <w:instrText xml:space="preserve"> PAGEREF _Toc243561965 \h </w:instrText>
+            </w:r>
+            <w:r>
+              <w:rPr>
+                <w:b/>
+                <w:bCs/>
+                <w:noProof/>
+                <w:webHidden/>
+              </w:rPr>
+            </w:r>
+            <w:r>
+              <w:rPr>
+                <w:b/>
+                <w:bCs/>
+                <w:noProof/>
+                <w:webHidden/>
+              </w:rPr>
+              <w:fldChar w:fldCharType="separate"/>
+            </w:r>
+            <w:r>
+              <w:rPr>
+                <w:b/>
+                <w:bCs/>
+                <w:noProof/>
+                <w:webHidden/>
+              </w:rPr>
+              <w:t>20</w:t>
+            </w:r>
+            <w:r>
+              <w:rPr>
+                <w:b/>
+                <w:bCs/>
+                <w:noProof/>
+                <w:webHidden/>
+              </w:rPr>
+              <w:fldChar w:fldCharType="end"/>
+            </w:r>
+          </w:hyperlink>
+        </w:p>
+        <w:p>
+          <w:pPr>
+            <w:pStyle w:val="TOC2"/>
+            <w:tabs>
+              <w:tab w:val="right" w:leader="dot" w:pos="8494"/>
+            </w:tabs>
+            <w:rPr>
+              <w:rFonts w:asciiTheme="minorHAnsi" w:eastAsiaTheme="minorEastAsia" w:hAnsiTheme="minorHAnsi" w:cstheme="minorBidi"/>
+              <w:b/>
+              <w:bCs/>
+              <w:noProof/>
+              <w:kern w:val="2"/>
+              <w:sz w:val="24"/>
+              <w:szCs w:val="24"/>
+              <w:lang w:val="en-GB" w:eastAsia="en-GB"/>
+              <w14:ligatures w14:val="standardContextual"/>
+            </w:rPr>
+          </w:pPr>
+          <w:hyperlink w:anchor="_Toc243561966" w:history="1">
+            <w:r>
+              <w:rPr>
+                <w:rStyle w:val="Hyperlink"/>
+                <w:rFonts w:ascii="Times New Roman" w:eastAsia="Times New Roman" w:hAnsi="Times New Roman" w:cs="Times New Roman"/>
+                <w:b/>
+                <w:bCs/>
+                <w:i/>
+                <w:iCs/>
+                <w:noProof/>
+                <w:lang w:val="en-GB" w:eastAsia="en-GB"/>
+              </w:rPr>
+              <w:t>References</w:t>
+            </w:r>
+            <w:r>
+              <w:rPr>
+                <w:b/>
+                <w:bCs/>
+                <w:noProof/>
+                <w:webHidden/>
+              </w:rPr>
+              <w:tab/>
+            </w:r>
+            <w:r>
+              <w:rPr>
+                <w:b/>
+                <w:bCs/>
+                <w:noProof/>
+                <w:webHidden/>
+              </w:rPr>
+              <w:fldChar w:fldCharType="begin"/>
+            </w:r>
+            <w:r>
+              <w:rPr>
+                <w:b/>
+                <w:bCs/>
+                <w:noProof/>
+                <w:webHidden/>
+              </w:rPr>
+              <w:instrText xml:space="preserve"> PAGEREF _Toc243561966 \h </w:instrText>
+            </w:r>
+            <w:r>
+              <w:rPr>
+                <w:b/>
+                <w:bCs/>
+                <w:noProof/>
+                <w:webHidden/>
+              </w:rPr>
+            </w:r>
+            <w:r>
+              <w:rPr>
+                <w:b/>
+                <w:bCs/>
+                <w:noProof/>
+                <w:webHidden/>
+              </w:rPr>
+              <w:fldChar w:fldCharType="separate"/>
+            </w:r>
+            <w:r>
+              <w:rPr>
+                <w:b/>
+                <w:bCs/>
+                <w:noProof/>
+                <w:webHidden/>
+              </w:rPr>
+              <w:t>21</w:t>
+            </w:r>
+            <w:r>
+              <w:rPr>
+                <w:b/>
+                <w:bCs/>
+                <w:noProof/>
+                <w:webHidden/>
+              </w:rPr>
+              <w:fldChar w:fldCharType="end"/>
+            </w:r>
+          </w:hyperlink>
+        </w:p>
+        <w:p>
+          <w:pPr>
+            <w:rPr>
+              <w:b/>
+              <w:bCs/>
+            </w:rPr>
+          </w:pPr>
+          <w:r>
+            <w:rPr>
+              <w:rFonts w:ascii="Times New Roman" w:hAnsi="Times New Roman" w:cs="Times New Roman"/>
+              <w:b/>
+              <w:bCs/>
+            </w:rPr>
+            <w:fldChar w:fldCharType="end"/>
+          </w:r>
+        </w:p>
+      </w:sdtContent>
+    </w:sdt>
     <w:p>
       <w:pPr>
         <w:jc w:val="center"/>
         <w:rPr>
-          <w:ins w:id="54" w:author="Nicolas Cancino" w:date="2026-10-19T19:10:00Z" w16du:dateUtc="2026-10-19T18:10:00Z"/>
+          <w:ins w:id="53" w:author="Nicolas Cancino" w:date="2026-10-19T19:10:00Z" w16du:dateUtc="2026-10-19T18:10:00Z"/>
           <w:rFonts w:ascii="Times New Roman" w:hAnsi="Times New Roman" w:cs="Times New Roman"/>
           <w:i/>
           <w:color w:val="000000" w:themeColor="text1"/>
@@ -1282,7 +3104,7 @@
       <w:pPr>
         <w:jc w:val="center"/>
         <w:rPr>
-          <w:ins w:id="55" w:author="Nicolas Cancino" w:date="2026-10-19T19:10:00Z" w16du:dateUtc="2026-10-19T18:10:00Z"/>
+          <w:ins w:id="54" w:author="Nicolas Cancino" w:date="2026-10-19T19:10:00Z" w16du:dateUtc="2026-10-19T18:10:00Z"/>
           <w:rFonts w:ascii="Times New Roman" w:hAnsi="Times New Roman" w:cs="Times New Roman"/>
           <w:i/>
           <w:color w:val="000000" w:themeColor="text1"/>
@@ -1296,7 +3118,7 @@
       <w:pPr>
         <w:jc w:val="center"/>
         <w:rPr>
-          <w:ins w:id="56" w:author="Nicolas Cancino" w:date="2026-10-19T19:10:00Z" w16du:dateUtc="2026-10-19T18:10:00Z"/>
+          <w:ins w:id="55" w:author="Nicolas Cancino" w:date="2026-10-19T19:10:00Z" w16du:dateUtc="2026-10-19T18:10:00Z"/>
           <w:rFonts w:ascii="Times New Roman" w:hAnsi="Times New Roman" w:cs="Times New Roman"/>
           <w:i/>
           <w:color w:val="000000" w:themeColor="text1"/>
@@ -1310,7 +3132,7 @@
       <w:pPr>
         <w:jc w:val="center"/>
         <w:rPr>
-          <w:ins w:id="57" w:author="Nicolas Cancino" w:date="2026-10-19T19:10:00Z" w16du:dateUtc="2026-10-19T18:10:00Z"/>
+          <w:ins w:id="56" w:author="Nicolas Cancino" w:date="2026-10-19T19:10:00Z" w16du:dateUtc="2026-10-19T18:10:00Z"/>
           <w:rFonts w:ascii="Times New Roman" w:hAnsi="Times New Roman" w:cs="Times New Roman"/>
           <w:i/>
           <w:color w:val="000000" w:themeColor="text1"/>
@@ -1324,7 +3146,7 @@
       <w:pPr>
         <w:jc w:val="center"/>
         <w:rPr>
-          <w:ins w:id="58" w:author="Nicolas Cancino" w:date="2026-10-19T19:10:00Z" w16du:dateUtc="2026-10-19T18:10:00Z"/>
+          <w:ins w:id="57" w:author="Nicolas Cancino" w:date="2026-10-19T19:10:00Z" w16du:dateUtc="2026-10-19T18:10:00Z"/>
           <w:rFonts w:ascii="Times New Roman" w:hAnsi="Times New Roman" w:cs="Times New Roman"/>
           <w:i/>
           <w:color w:val="000000" w:themeColor="text1"/>
@@ -1338,7 +3160,7 @@
       <w:pPr>
         <w:jc w:val="center"/>
         <w:rPr>
-          <w:ins w:id="59" w:author="Nicolas Cancino" w:date="2026-10-19T19:10:00Z" w16du:dateUtc="2026-10-19T18:10:00Z"/>
+          <w:ins w:id="58" w:author="Nicolas Cancino" w:date="2026-10-19T19:10:00Z" w16du:dateUtc="2026-10-19T18:10:00Z"/>
           <w:rFonts w:ascii="Times New Roman" w:hAnsi="Times New Roman" w:cs="Times New Roman"/>
           <w:i/>
           <w:color w:val="000000" w:themeColor="text1"/>
@@ -1352,7 +3174,7 @@
       <w:pPr>
         <w:jc w:val="center"/>
         <w:rPr>
-          <w:ins w:id="60" w:author="Nicolas Cancino" w:date="2026-10-19T19:10:00Z" w16du:dateUtc="2026-10-19T18:10:00Z"/>
+          <w:ins w:id="59" w:author="Nicolas Cancino" w:date="2026-10-19T19:10:00Z" w16du:dateUtc="2026-10-19T18:10:00Z"/>
           <w:rFonts w:ascii="Times New Roman" w:hAnsi="Times New Roman" w:cs="Times New Roman"/>
           <w:i/>
           <w:color w:val="000000" w:themeColor="text1"/>
@@ -1366,7 +3188,7 @@
       <w:pPr>
         <w:jc w:val="center"/>
         <w:rPr>
-          <w:ins w:id="61" w:author="Nicolas Cancino" w:date="2026-10-19T19:10:00Z" w16du:dateUtc="2026-10-19T18:10:00Z"/>
+          <w:ins w:id="60" w:author="Nicolas Cancino" w:date="2026-10-19T19:10:00Z" w16du:dateUtc="2026-10-19T18:10:00Z"/>
           <w:rFonts w:ascii="Times New Roman" w:hAnsi="Times New Roman" w:cs="Times New Roman"/>
           <w:i/>
           <w:color w:val="000000" w:themeColor="text1"/>
@@ -1378,135 +3200,63 @@
     </w:p>
     <w:p>
       <w:pPr>
+        <w:pStyle w:val="Heading1"/>
+        <w:rPr>
+          <w:rFonts w:ascii="Times New Roman" w:hAnsi="Times New Roman" w:cs="Times New Roman"/>
+          <w:color w:val="000000" w:themeColor="text1"/>
+          <w14:textOutline w14:w="9525" w14:cap="rnd" w14:cmpd="sng" w14:algn="ctr">
+            <w14:noFill/>
+            <w14:prstDash w14:val="solid"/>
+            <w14:bevel/>
+          </w14:textOutline>
+        </w:rPr>
+      </w:pPr>
+    </w:p>
+    <w:p>
+      <w:pPr>
+        <w:pStyle w:val="Heading1"/>
+        <w:rPr>
+          <w:ins w:id="61" w:author="Nicolas Cancino" w:date="2026-10-19T19:11:00Z" w16du:dateUtc="2026-10-19T18:11:00Z"/>
+          <w:rFonts w:ascii="Times New Roman" w:hAnsi="Times New Roman" w:cs="Times New Roman"/>
+          <w:color w:val="000000" w:themeColor="text1"/>
+          <w14:textOutline w14:w="9525" w14:cap="rnd" w14:cmpd="sng" w14:algn="ctr">
+            <w14:noFill/>
+            <w14:prstDash w14:val="solid"/>
+            <w14:bevel/>
+          </w14:textOutline>
+        </w:rPr>
+      </w:pPr>
+      <w:bookmarkStart w:id="62" w:name="_Toc243561951"/>
+      <w:ins w:id="63" w:author="Nicolas Cancino" w:date="2026-10-19T19:07:00Z" w16du:dateUtc="2026-10-19T18:07:00Z">
+        <w:r>
+          <w:rPr>
+            <w:rFonts w:ascii="Times New Roman" w:hAnsi="Times New Roman" w:cs="Times New Roman"/>
+            <w:color w:val="000000" w:themeColor="text1"/>
+            <w14:textOutline w14:w="9525" w14:cap="rnd" w14:cmpd="sng" w14:algn="ctr">
+              <w14:noFill/>
+              <w14:prstDash w14:val="solid"/>
+              <w14:bevel/>
+            </w14:textOutline>
+            <w:rPrChange w:id="64" w:author="Nicolas Cancino" w:date="2026-10-19T19:11:00Z" w16du:dateUtc="2026-10-19T18:11:00Z">
+              <w:rPr>
+                <w:i/>
+                <w:color w:val="156082"/>
+                <w:sz w:val="32"/>
+                <w:szCs w:val="32"/>
+                <w:lang w:val="en-GB"/>
+              </w:rPr>
+            </w:rPrChange>
+          </w:rPr>
+          <w:t>Demographic Patterns and Health Impacts of Air Pollution in New York City: A Data Analytics Approach</w:t>
+        </w:r>
+      </w:ins>
+      <w:bookmarkEnd w:id="62"/>
+    </w:p>
+    <w:p>
+      <w:pPr>
         <w:jc w:val="center"/>
         <w:rPr>
-          <w:ins w:id="62" w:author="Nicolas Cancino" w:date="2026-10-19T19:10:00Z" w16du:dateUtc="2026-10-19T18:10:00Z"/>
-          <w:rFonts w:ascii="Times New Roman" w:hAnsi="Times New Roman" w:cs="Times New Roman"/>
-          <w:i/>
-          <w:color w:val="000000" w:themeColor="text1"/>
-          <w:sz w:val="32"/>
-          <w:szCs w:val="32"/>
-          <w:lang w:val="en-GB"/>
-        </w:rPr>
-      </w:pPr>
-    </w:p>
-    <w:p>
-      <w:pPr>
-        <w:jc w:val="center"/>
-        <w:rPr>
-          <w:ins w:id="63" w:author="Nicolas Cancino" w:date="2026-10-19T19:10:00Z" w16du:dateUtc="2026-10-19T18:10:00Z"/>
-          <w:rFonts w:ascii="Times New Roman" w:hAnsi="Times New Roman" w:cs="Times New Roman"/>
-          <w:i/>
-          <w:color w:val="000000" w:themeColor="text1"/>
-          <w:sz w:val="32"/>
-          <w:szCs w:val="32"/>
-          <w:lang w:val="en-GB"/>
-        </w:rPr>
-      </w:pPr>
-    </w:p>
-    <w:p>
-      <w:pPr>
-        <w:jc w:val="center"/>
-        <w:rPr>
-          <w:ins w:id="64" w:author="Nicolas Cancino" w:date="2026-10-19T19:10:00Z" w16du:dateUtc="2026-10-19T18:10:00Z"/>
-          <w:rFonts w:ascii="Times New Roman" w:hAnsi="Times New Roman" w:cs="Times New Roman"/>
-          <w:i/>
-          <w:color w:val="000000" w:themeColor="text1"/>
-          <w:sz w:val="32"/>
-          <w:szCs w:val="32"/>
-          <w:lang w:val="en-GB"/>
-        </w:rPr>
-      </w:pPr>
-    </w:p>
-    <w:p>
-      <w:pPr>
-        <w:jc w:val="center"/>
-        <w:rPr>
-          <w:ins w:id="65" w:author="Nicolas Cancino" w:date="2026-10-19T19:10:00Z" w16du:dateUtc="2026-10-19T18:10:00Z"/>
-          <w:rFonts w:ascii="Times New Roman" w:hAnsi="Times New Roman" w:cs="Times New Roman"/>
-          <w:i/>
-          <w:color w:val="000000" w:themeColor="text1"/>
-          <w:sz w:val="32"/>
-          <w:szCs w:val="32"/>
-          <w:lang w:val="en-GB"/>
-        </w:rPr>
-      </w:pPr>
-    </w:p>
-    <w:p>
-      <w:pPr>
-        <w:jc w:val="center"/>
-        <w:rPr>
-          <w:ins w:id="66" w:author="Nicolas Cancino" w:date="2026-10-19T19:10:00Z" w16du:dateUtc="2026-10-19T18:10:00Z"/>
-          <w:rFonts w:ascii="Times New Roman" w:hAnsi="Times New Roman" w:cs="Times New Roman"/>
-          <w:i/>
-          <w:color w:val="000000" w:themeColor="text1"/>
-          <w:sz w:val="32"/>
-          <w:szCs w:val="32"/>
-          <w:lang w:val="en-GB"/>
-        </w:rPr>
-      </w:pPr>
-    </w:p>
-    <w:p>
-      <w:pPr>
-        <w:jc w:val="center"/>
-        <w:rPr>
-          <w:ins w:id="67" w:author="Nicolas Cancino" w:date="2026-10-19T19:10:00Z" w16du:dateUtc="2026-10-19T18:10:00Z"/>
-          <w:rFonts w:ascii="Times New Roman" w:hAnsi="Times New Roman" w:cs="Times New Roman"/>
-          <w:i/>
-          <w:color w:val="000000" w:themeColor="text1"/>
-          <w:sz w:val="32"/>
-          <w:szCs w:val="32"/>
-          <w:lang w:val="en-GB"/>
-        </w:rPr>
-      </w:pPr>
-    </w:p>
-    <w:p>
-      <w:pPr>
-        <w:jc w:val="center"/>
-        <w:rPr>
-          <w:ins w:id="68" w:author="Nicolas Cancino" w:date="2026-10-19T19:10:00Z" w16du:dateUtc="2026-10-19T18:10:00Z"/>
-          <w:rFonts w:ascii="Times New Roman" w:hAnsi="Times New Roman" w:cs="Times New Roman"/>
-          <w:i/>
-          <w:color w:val="000000" w:themeColor="text1"/>
-          <w:sz w:val="32"/>
-          <w:szCs w:val="32"/>
-          <w:lang w:val="en-GB"/>
-        </w:rPr>
-      </w:pPr>
-    </w:p>
-    <w:p>
-      <w:pPr>
-        <w:jc w:val="center"/>
-        <w:rPr>
-          <w:ins w:id="69" w:author="Nicolas Cancino" w:date="2026-10-19T19:10:00Z" w16du:dateUtc="2026-10-19T18:10:00Z"/>
-          <w:rFonts w:ascii="Times New Roman" w:hAnsi="Times New Roman" w:cs="Times New Roman"/>
-          <w:i/>
-          <w:color w:val="000000" w:themeColor="text1"/>
-          <w:sz w:val="32"/>
-          <w:szCs w:val="32"/>
-          <w:lang w:val="en-GB"/>
-        </w:rPr>
-      </w:pPr>
-    </w:p>
-    <w:p>
-      <w:pPr>
-        <w:jc w:val="center"/>
-        <w:rPr>
-          <w:ins w:id="70" w:author="Nicolas Cancino" w:date="2026-10-19T19:10:00Z" w16du:dateUtc="2026-10-19T18:10:00Z"/>
-          <w:rFonts w:ascii="Times New Roman" w:hAnsi="Times New Roman" w:cs="Times New Roman"/>
-          <w:i/>
-          <w:color w:val="000000" w:themeColor="text1"/>
-          <w:sz w:val="32"/>
-          <w:szCs w:val="32"/>
-          <w:lang w:val="en-GB"/>
-        </w:rPr>
-      </w:pPr>
-    </w:p>
-    <w:p>
-      <w:pPr>
-        <w:jc w:val="center"/>
-        <w:rPr>
-          <w:ins w:id="71" w:author="Nicolas Cancino" w:date="2026-10-19T19:11:00Z" w16du:dateUtc="2026-10-19T18:11:00Z"/>
+          <w:ins w:id="65" w:author="Nicolas Cancino" w:date="2026-10-19T19:11:00Z" w16du:dateUtc="2026-10-19T18:11:00Z"/>
           <w:rFonts w:ascii="Times New Roman" w:hAnsi="Times New Roman" w:cs="Times New Roman"/>
           <w:b/>
           <w:bCs/>
@@ -1517,156 +3267,114 @@
           <w:lang w:val="en-GB"/>
         </w:rPr>
       </w:pPr>
-      <w:ins w:id="72" w:author="Nicolas Cancino" w:date="2026-10-19T19:07:00Z" w16du:dateUtc="2026-10-19T18:07:00Z">
-        <w:r>
-          <w:rPr>
-            <w:rFonts w:ascii="Times New Roman" w:hAnsi="Times New Roman" w:cs="Times New Roman"/>
-            <w:b/>
-            <w:bCs/>
-            <w:i/>
-            <w:color w:val="000000" w:themeColor="text1"/>
-            <w:sz w:val="32"/>
-            <w:szCs w:val="32"/>
-            <w:lang w:val="en-GB"/>
-            <w:rPrChange w:id="73" w:author="Nicolas Cancino" w:date="2026-10-19T19:11:00Z" w16du:dateUtc="2026-10-19T18:11:00Z">
-              <w:rPr>
-                <w:i/>
-                <w:color w:val="156082"/>
-                <w:sz w:val="32"/>
-                <w:szCs w:val="32"/>
-                <w:lang w:val="en-GB"/>
-              </w:rPr>
-            </w:rPrChange>
-          </w:rPr>
-          <w:lastRenderedPageBreak/>
-          <w:t>Demographic Patterns and Health Impacts of Air Pollution in New York City: A Data Analytics Approach</w:t>
-        </w:r>
-      </w:ins>
-    </w:p>
-    <w:p>
-      <w:pPr>
-        <w:jc w:val="center"/>
-        <w:rPr>
-          <w:ins w:id="74" w:author="Nicolas Cancino" w:date="2026-10-19T19:11:00Z" w16du:dateUtc="2026-10-19T18:11:00Z"/>
+    </w:p>
+    <w:p>
+      <w:pPr>
+        <w:rPr>
+          <w:ins w:id="66" w:author="Nicolas Cancino" w:date="2026-10-19T19:12:00Z" w16du:dateUtc="2026-10-19T18:12:00Z"/>
           <w:rFonts w:ascii="Times New Roman" w:hAnsi="Times New Roman" w:cs="Times New Roman"/>
           <w:b/>
           <w:bCs/>
           <w:i/>
           <w:color w:val="000000" w:themeColor="text1"/>
-          <w:sz w:val="32"/>
-          <w:szCs w:val="32"/>
-          <w:lang w:val="en-GB"/>
-        </w:rPr>
-      </w:pPr>
-    </w:p>
-    <w:p>
-      <w:pPr>
-        <w:rPr>
-          <w:ins w:id="75" w:author="Nicolas Cancino" w:date="2026-10-19T19:12:00Z" w16du:dateUtc="2026-10-19T18:12:00Z"/>
-          <w:rFonts w:ascii="Times New Roman" w:hAnsi="Times New Roman" w:cs="Times New Roman"/>
-          <w:b/>
-          <w:bCs/>
+          <w:lang w:val="en-GB"/>
+        </w:rPr>
+      </w:pPr>
+    </w:p>
+    <w:p>
+      <w:pPr>
+        <w:pStyle w:val="Heading2"/>
+        <w:rPr>
+          <w:ins w:id="67" w:author="Nicolas Cancino" w:date="2026-10-19T19:12:00Z" w16du:dateUtc="2026-10-19T18:12:00Z"/>
+          <w:rFonts w:ascii="Times New Roman" w:hAnsi="Times New Roman" w:cs="Times New Roman"/>
           <w:i/>
+          <w:iCs/>
           <w:color w:val="000000" w:themeColor="text1"/>
           <w:lang w:val="en-GB"/>
         </w:rPr>
       </w:pPr>
-    </w:p>
-    <w:p>
-      <w:pPr>
-        <w:rPr>
-          <w:ins w:id="76" w:author="Nicolas Cancino" w:date="2026-10-19T19:12:00Z" w16du:dateUtc="2026-10-19T18:12:00Z"/>
-          <w:rFonts w:ascii="Times New Roman" w:hAnsi="Times New Roman" w:cs="Times New Roman"/>
-          <w:b/>
-          <w:bCs/>
+      <w:bookmarkStart w:id="68" w:name="_Toc243561952"/>
+      <w:ins w:id="69" w:author="Nicolas Cancino" w:date="2026-10-19T19:12:00Z" w16du:dateUtc="2026-10-19T18:12:00Z">
+        <w:r>
+          <w:rPr>
+            <w:rFonts w:ascii="Times New Roman" w:hAnsi="Times New Roman" w:cs="Times New Roman"/>
+            <w:i/>
+            <w:iCs/>
+            <w:color w:val="000000" w:themeColor="text1"/>
+            <w:lang w:val="en-GB"/>
+          </w:rPr>
+          <w:t>Introduction</w:t>
+        </w:r>
+        <w:bookmarkEnd w:id="68"/>
+      </w:ins>
+    </w:p>
+    <w:p>
+      <w:pPr>
+        <w:rPr>
+          <w:rFonts w:ascii="Times New Roman" w:hAnsi="Times New Roman" w:cs="Times New Roman"/>
+          <w:iCs/>
+          <w:color w:val="000000" w:themeColor="text1"/>
+          <w:lang w:val="en-GB"/>
+        </w:rPr>
+      </w:pPr>
+      <w:r>
+        <w:rPr>
+          <w:rFonts w:ascii="Times New Roman" w:hAnsi="Times New Roman" w:cs="Times New Roman"/>
+          <w:iCs/>
+          <w:color w:val="000000" w:themeColor="text1"/>
+          <w:lang w:val="en-GB"/>
+        </w:rPr>
+        <w:t>One of the major problems of our time is air pollution, particularly in highly urbanised cities, where it has been associated with cardiorespiratory diseases and even cancer. Numerous pollutants contribute to the development of these conditions in humans, particularly particulate matter (PM), which can penetrate the respiratory system. Using air pollution measurements from New York City, provided by the Department of Health and Mental Hygiene (DOHMH), this project aims to geographically identify areas of New York with higher levels of air pollution through data analysis and explore how these levels may be associated with a higher prevalence of cardiorespiratory diseases among the exposed population.</w:t>
+      </w:r>
+    </w:p>
+    <w:p>
+      <w:pPr>
+        <w:pStyle w:val="Heading2"/>
+        <w:rPr>
+          <w:color w:val="000000" w:themeColor="text1"/>
+          <w:lang w:val="en-GB"/>
+        </w:rPr>
+      </w:pPr>
+    </w:p>
+    <w:p>
+      <w:pPr>
+        <w:pStyle w:val="Heading2"/>
+        <w:rPr>
+          <w:rFonts w:ascii="Times New Roman" w:hAnsi="Times New Roman" w:cs="Times New Roman"/>
+          <w:i/>
+          <w:sz w:val="28"/>
+          <w:szCs w:val="28"/>
+          <w:lang w:val="en-GB"/>
+        </w:rPr>
+      </w:pPr>
+      <w:bookmarkStart w:id="70" w:name="_Toc243561953"/>
+      <w:r>
+        <w:rPr>
+          <w:rFonts w:ascii="Times New Roman" w:hAnsi="Times New Roman" w:cs="Times New Roman"/>
           <w:i/>
           <w:color w:val="000000" w:themeColor="text1"/>
           <w:sz w:val="28"/>
           <w:szCs w:val="28"/>
           <w:lang w:val="en-GB"/>
         </w:rPr>
-      </w:pPr>
-      <w:ins w:id="77" w:author="Nicolas Cancino" w:date="2026-10-19T19:12:00Z" w16du:dateUtc="2026-10-19T18:12:00Z">
-        <w:r>
-          <w:rPr>
-            <w:rFonts w:ascii="Times New Roman" w:hAnsi="Times New Roman" w:cs="Times New Roman"/>
-            <w:b/>
-            <w:bCs/>
-            <w:i/>
-            <w:color w:val="000000" w:themeColor="text1"/>
-            <w:sz w:val="28"/>
-            <w:szCs w:val="28"/>
-            <w:lang w:val="en-GB"/>
-          </w:rPr>
-          <w:t>Introduction</w:t>
-        </w:r>
-      </w:ins>
-    </w:p>
-    <w:p>
-      <w:pPr>
-        <w:rPr>
-          <w:rFonts w:ascii="Times New Roman" w:hAnsi="Times New Roman" w:cs="Times New Roman"/>
-          <w:iCs/>
-          <w:color w:val="000000" w:themeColor="text1"/>
-          <w:lang w:val="en-GB"/>
-        </w:rPr>
-      </w:pPr>
-      <w:r>
-        <w:rPr>
-          <w:rFonts w:ascii="Times New Roman" w:hAnsi="Times New Roman" w:cs="Times New Roman"/>
-          <w:iCs/>
-          <w:color w:val="000000" w:themeColor="text1"/>
-          <w:lang w:val="en-GB"/>
-        </w:rPr>
-        <w:t>One of the major problems of our time is air pollution, particularly in highly urbanised cities, where it has been associated with cardiorespiratory diseases and even cancer. Numerous pollutants contribute to the development of these conditions in humans, particularly particulate matter (PM), which can penetrate the respiratory system. Using air pollution measurements from New York City, provided by the Department of Health and Mental Hygiene (DOHMH), this project aims to geographically identify areas of New York with higher levels of air pollution through data analysis and explore how these levels may be associated with a higher prevalence of cardiorespiratory diseases among the exposed population.</w:t>
-      </w:r>
-    </w:p>
-    <w:p>
-      <w:pPr>
-        <w:rPr>
-          <w:rFonts w:ascii="Times New Roman" w:hAnsi="Times New Roman" w:cs="Times New Roman"/>
-          <w:iCs/>
-          <w:color w:val="000000" w:themeColor="text1"/>
-          <w:lang w:val="en-GB"/>
-        </w:rPr>
-      </w:pPr>
-    </w:p>
-    <w:p>
-      <w:pPr>
-        <w:tabs>
-          <w:tab w:val="left" w:pos="2869"/>
-        </w:tabs>
-        <w:rPr>
-          <w:rFonts w:ascii="Times New Roman" w:hAnsi="Times New Roman" w:cs="Times New Roman"/>
-          <w:b/>
-          <w:bCs/>
+        <w:t>Problem Definition</w:t>
+      </w:r>
+      <w:bookmarkEnd w:id="70"/>
+      <w:r>
+        <w:rPr>
+          <w:rFonts w:ascii="Times New Roman" w:hAnsi="Times New Roman" w:cs="Times New Roman"/>
           <w:i/>
           <w:color w:val="000000" w:themeColor="text1"/>
           <w:sz w:val="28"/>
           <w:szCs w:val="28"/>
           <w:lang w:val="en-GB"/>
         </w:rPr>
-      </w:pPr>
-      <w:r>
-        <w:rPr>
-          <w:rFonts w:ascii="Times New Roman" w:hAnsi="Times New Roman" w:cs="Times New Roman"/>
-          <w:b/>
-          <w:bCs/>
+        <w:t xml:space="preserve"> </w:t>
+      </w:r>
+      <w:r>
+        <w:rPr>
+          <w:rFonts w:ascii="Times New Roman" w:hAnsi="Times New Roman" w:cs="Times New Roman"/>
           <w:i/>
-          <w:color w:val="000000" w:themeColor="text1"/>
-          <w:sz w:val="28"/>
-          <w:szCs w:val="28"/>
-          <w:lang w:val="en-GB"/>
-        </w:rPr>
-        <w:t xml:space="preserve">Problem Definition </w:t>
-      </w:r>
-      <w:r>
-        <w:rPr>
-          <w:rFonts w:ascii="Times New Roman" w:hAnsi="Times New Roman" w:cs="Times New Roman"/>
-          <w:b/>
-          <w:bCs/>
-          <w:i/>
-          <w:color w:val="000000" w:themeColor="text1"/>
           <w:sz w:val="28"/>
           <w:szCs w:val="28"/>
           <w:lang w:val="en-GB"/>
@@ -1711,32 +3419,36 @@
     </w:p>
     <w:p>
       <w:pPr>
-        <w:tabs>
-          <w:tab w:val="left" w:pos="2869"/>
-        </w:tabs>
-        <w:rPr>
-          <w:rFonts w:ascii="Times New Roman" w:hAnsi="Times New Roman" w:cs="Times New Roman"/>
-          <w:b/>
-          <w:bCs/>
+        <w:pStyle w:val="Heading2"/>
+        <w:rPr>
+          <w:rFonts w:ascii="Times New Roman" w:hAnsi="Times New Roman" w:cs="Times New Roman"/>
           <w:i/>
+          <w:iCs/>
           <w:color w:val="000000" w:themeColor="text1"/>
-          <w:sz w:val="28"/>
-          <w:szCs w:val="28"/>
-          <w:lang w:val="en-GB"/>
-        </w:rPr>
-      </w:pPr>
-      <w:r>
-        <w:rPr>
-          <w:rFonts w:ascii="Times New Roman" w:hAnsi="Times New Roman" w:cs="Times New Roman"/>
-          <w:b/>
-          <w:bCs/>
+          <w:lang w:val="en-GB"/>
+        </w:rPr>
+      </w:pPr>
+      <w:bookmarkStart w:id="71" w:name="_Toc243561954"/>
+      <w:r>
+        <w:rPr>
+          <w:rFonts w:ascii="Times New Roman" w:hAnsi="Times New Roman" w:cs="Times New Roman"/>
           <w:i/>
+          <w:iCs/>
           <w:color w:val="000000" w:themeColor="text1"/>
-          <w:sz w:val="28"/>
-          <w:szCs w:val="28"/>
-          <w:lang w:val="en-GB"/>
-        </w:rPr>
-        <w:t xml:space="preserve">Aim and Objectives </w:t>
+          <w:lang w:val="en-GB"/>
+        </w:rPr>
+        <w:t>Aim and Objectives</w:t>
+      </w:r>
+      <w:bookmarkEnd w:id="71"/>
+      <w:r>
+        <w:rPr>
+          <w:rFonts w:ascii="Times New Roman" w:hAnsi="Times New Roman" w:cs="Times New Roman"/>
+          <w:i/>
+          <w:iCs/>
+          <w:color w:val="000000" w:themeColor="text1"/>
+          <w:lang w:val="en-GB"/>
+        </w:rPr>
+        <w:t xml:space="preserve"> </w:t>
       </w:r>
     </w:p>
     <w:p>
@@ -1765,7 +3477,7 @@
           <w:rFonts w:ascii="Times New Roman" w:hAnsi="Times New Roman" w:cs="Times New Roman"/>
           <w:b/>
           <w:bCs/>
-          <w:iCs/>
+          <w:i/>
           <w:color w:val="000000" w:themeColor="text1"/>
           <w:sz w:val="24"/>
           <w:szCs w:val="24"/>
@@ -1777,7 +3489,7 @@
           <w:rFonts w:ascii="Times New Roman" w:hAnsi="Times New Roman" w:cs="Times New Roman"/>
           <w:b/>
           <w:bCs/>
-          <w:iCs/>
+          <w:i/>
           <w:color w:val="000000" w:themeColor="text1"/>
           <w:sz w:val="24"/>
           <w:szCs w:val="24"/>
@@ -1830,24 +3542,59 @@
           <w:rFonts w:ascii="Times New Roman" w:hAnsi="Times New Roman" w:cs="Times New Roman"/>
           <w:b/>
           <w:bCs/>
-          <w:iCs/>
+          <w:i/>
           <w:color w:val="000000" w:themeColor="text1"/>
           <w:sz w:val="24"/>
           <w:szCs w:val="24"/>
           <w:lang w:val="en-GB"/>
         </w:rPr>
       </w:pPr>
-      <w:r>
+    </w:p>
+    <w:p>
+      <w:pPr>
+        <w:tabs>
+          <w:tab w:val="left" w:pos="2869"/>
+        </w:tabs>
         <w:rPr>
           <w:rFonts w:ascii="Times New Roman" w:hAnsi="Times New Roman" w:cs="Times New Roman"/>
           <w:b/>
           <w:bCs/>
-          <w:iCs/>
+          <w:i/>
           <w:color w:val="000000" w:themeColor="text1"/>
           <w:sz w:val="24"/>
           <w:szCs w:val="24"/>
           <w:lang w:val="en-GB"/>
         </w:rPr>
+      </w:pPr>
+    </w:p>
+    <w:p>
+      <w:pPr>
+        <w:tabs>
+          <w:tab w:val="left" w:pos="2869"/>
+        </w:tabs>
+        <w:rPr>
+          <w:rFonts w:ascii="Times New Roman" w:hAnsi="Times New Roman" w:cs="Times New Roman"/>
+          <w:b/>
+          <w:bCs/>
+          <w:i/>
+          <w:color w:val="000000" w:themeColor="text1"/>
+          <w:sz w:val="24"/>
+          <w:szCs w:val="24"/>
+          <w:lang w:val="en-GB"/>
+        </w:rPr>
+      </w:pPr>
+      <w:r>
+        <w:rPr>
+          <w:rFonts w:ascii="Times New Roman" w:hAnsi="Times New Roman" w:cs="Times New Roman"/>
+          <w:b/>
+          <w:bCs/>
+          <w:i/>
+          <w:color w:val="000000" w:themeColor="text1"/>
+          <w:sz w:val="24"/>
+          <w:szCs w:val="24"/>
+          <w:lang w:val="en-GB"/>
+        </w:rPr>
+        <w:lastRenderedPageBreak/>
         <w:t>Objectives</w:t>
       </w:r>
     </w:p>
@@ -1917,15 +3664,7 @@
           <w:rFonts w:ascii="Times New Roman" w:hAnsi="Times New Roman" w:cs="Times New Roman"/>
           <w:lang w:val="en-GB"/>
         </w:rPr>
-        <w:t xml:space="preserve"> To identify geographical and temporal patterns in the concentrations of environmental pollutants, particularly PM2.5 and others, across </w:t>
-      </w:r>
-      <w:r>
-        <w:rPr>
-          <w:rFonts w:ascii="Times New Roman" w:hAnsi="Times New Roman" w:cs="Times New Roman"/>
-          <w:lang w:val="en-GB"/>
-        </w:rPr>
-        <w:lastRenderedPageBreak/>
-        <w:t>different areas of New York City using the prepared dataset, statistical analysis, and data visualisation tools.</w:t>
+        <w:t xml:space="preserve"> To identify geographical and temporal patterns in the concentrations of environmental pollutants, particularly PM2.5 and others, across different areas of New York City using the prepared dataset, statistical analysis, and data visualisation tools.</w:t>
       </w:r>
     </w:p>
     <w:p>
@@ -2044,7 +3783,7 @@
           <w:rFonts w:ascii="Times New Roman" w:hAnsi="Times New Roman" w:cs="Times New Roman"/>
           <w:b/>
           <w:bCs/>
-          <w:iCs/>
+          <w:i/>
           <w:color w:val="000000" w:themeColor="text1"/>
           <w:sz w:val="24"/>
           <w:szCs w:val="24"/>
@@ -2052,83 +3791,77 @@
         </w:rPr>
       </w:pPr>
       <w:r>
-        <w:rPr>
-          <w:rFonts w:ascii="Times New Roman" w:hAnsi="Times New Roman" w:cs="Times New Roman"/>
-          <w:b/>
-          <w:bCs/>
-          <w:iCs/>
-          <w:color w:val="000000" w:themeColor="text1"/>
-          <w:sz w:val="24"/>
-          <w:szCs w:val="24"/>
-          <w:lang w:val="en-GB"/>
-        </w:rPr>
-        <w:t>Business Objective</w:t>
-      </w:r>
-    </w:p>
-    <w:p>
-      <w:pPr>
-        <w:tabs>
-          <w:tab w:val="left" w:pos="2869"/>
-        </w:tabs>
-        <w:rPr>
-          <w:rFonts w:ascii="Times New Roman" w:hAnsi="Times New Roman" w:cs="Times New Roman"/>
-          <w:iCs/>
-          <w:color w:val="000000" w:themeColor="text1"/>
-          <w:lang w:val="en-GB"/>
-        </w:rPr>
-      </w:pPr>
-      <w:r>
-        <w:rPr>
-          <w:rFonts w:ascii="Times New Roman" w:hAnsi="Times New Roman" w:cs="Times New Roman"/>
-          <w:iCs/>
-          <w:color w:val="000000" w:themeColor="text1"/>
-          <w:lang w:val="en-GB"/>
-        </w:rPr>
-        <w:t>The analysis of this data allows us primarily to identify areas that may require stricter environmental and public health monitoring. This enables authorities to better prepare for potential risks to the population, highlighting the importance of prevention and action in avoiding a purely reactive healthcare policy that only responds when a disease emerges. Such an approach may result in higher costs for the hospital system compared to a proactive policy that anticipates problems and helps reduce healthcare costs.</w:t>
-      </w:r>
-    </w:p>
-    <w:p>
-      <w:pPr>
-        <w:tabs>
-          <w:tab w:val="left" w:pos="2869"/>
-        </w:tabs>
-        <w:rPr>
-          <w:rFonts w:ascii="Times New Roman" w:hAnsi="Times New Roman" w:cs="Times New Roman"/>
-          <w:iCs/>
-          <w:color w:val="000000" w:themeColor="text1"/>
-          <w:lang w:val="en-GB"/>
-        </w:rPr>
-      </w:pPr>
-    </w:p>
-    <w:p>
-      <w:pPr>
-        <w:tabs>
-          <w:tab w:val="left" w:pos="2869"/>
-        </w:tabs>
         <w:rPr>
           <w:rFonts w:ascii="Times New Roman" w:hAnsi="Times New Roman" w:cs="Times New Roman"/>
           <w:b/>
           <w:bCs/>
           <w:i/>
           <w:color w:val="000000" w:themeColor="text1"/>
-          <w:sz w:val="28"/>
-          <w:szCs w:val="28"/>
-          <w:lang w:val="en-GB"/>
-        </w:rPr>
-      </w:pPr>
-      <w:r>
-        <w:rPr>
-          <w:rFonts w:ascii="Times New Roman" w:hAnsi="Times New Roman" w:cs="Times New Roman"/>
-          <w:b/>
-          <w:bCs/>
+          <w:sz w:val="24"/>
+          <w:szCs w:val="24"/>
+          <w:lang w:val="en-GB"/>
+        </w:rPr>
+        <w:t>Business Objective</w:t>
+      </w:r>
+    </w:p>
+    <w:p>
+      <w:pPr>
+        <w:tabs>
+          <w:tab w:val="left" w:pos="2869"/>
+        </w:tabs>
+        <w:rPr>
+          <w:rFonts w:ascii="Times New Roman" w:hAnsi="Times New Roman" w:cs="Times New Roman"/>
+          <w:iCs/>
+          <w:color w:val="000000" w:themeColor="text1"/>
+          <w:lang w:val="en-GB"/>
+        </w:rPr>
+      </w:pPr>
+      <w:r>
+        <w:rPr>
+          <w:rFonts w:ascii="Times New Roman" w:hAnsi="Times New Roman" w:cs="Times New Roman"/>
+          <w:iCs/>
+          <w:color w:val="000000" w:themeColor="text1"/>
+          <w:lang w:val="en-GB"/>
+        </w:rPr>
+        <w:t>The analysis of this data allows us primarily to identify areas that may require stricter environmental and public health monitoring. This enables authorities to better prepare for potential risks to the population, highlighting the importance of prevention and action in avoiding a purely reactive healthcare policy that only responds when a disease emerges. Such an approach may result in higher costs for the hospital system compared to a proactive policy that anticipates problems and helps reduce healthcare costs.</w:t>
+      </w:r>
+    </w:p>
+    <w:p>
+      <w:pPr>
+        <w:tabs>
+          <w:tab w:val="left" w:pos="2869"/>
+        </w:tabs>
+        <w:rPr>
+          <w:rFonts w:ascii="Times New Roman" w:hAnsi="Times New Roman" w:cs="Times New Roman"/>
+          <w:iCs/>
+          <w:color w:val="000000" w:themeColor="text1"/>
+          <w:lang w:val="en-GB"/>
+        </w:rPr>
+      </w:pPr>
+    </w:p>
+    <w:p>
+      <w:pPr>
+        <w:pStyle w:val="Heading2"/>
+        <w:rPr>
+          <w:rFonts w:ascii="Times New Roman" w:hAnsi="Times New Roman" w:cs="Times New Roman"/>
           <w:i/>
+          <w:iCs/>
           <w:color w:val="000000" w:themeColor="text1"/>
-          <w:sz w:val="28"/>
-          <w:szCs w:val="28"/>
+          <w:lang w:val="en-GB"/>
+        </w:rPr>
+      </w:pPr>
+      <w:bookmarkStart w:id="72" w:name="_Toc243561955"/>
+      <w:r>
+        <w:rPr>
+          <w:rFonts w:ascii="Times New Roman" w:hAnsi="Times New Roman" w:cs="Times New Roman"/>
+          <w:i/>
+          <w:iCs/>
+          <w:color w:val="000000" w:themeColor="text1"/>
           <w:lang w:val="en-GB"/>
         </w:rPr>
         <w:t>Scope</w:t>
       </w:r>
+      <w:bookmarkEnd w:id="72"/>
     </w:p>
     <w:p>
       <w:pPr>
@@ -2156,7 +3889,7 @@
           <w:rFonts w:ascii="Times New Roman" w:hAnsi="Times New Roman" w:cs="Times New Roman"/>
           <w:b/>
           <w:bCs/>
-          <w:iCs/>
+          <w:i/>
           <w:color w:val="000000" w:themeColor="text1"/>
           <w:sz w:val="24"/>
           <w:szCs w:val="24"/>
@@ -2168,7 +3901,7 @@
           <w:rFonts w:ascii="Times New Roman" w:hAnsi="Times New Roman" w:cs="Times New Roman"/>
           <w:b/>
           <w:bCs/>
-          <w:iCs/>
+          <w:i/>
           <w:color w:val="000000" w:themeColor="text1"/>
           <w:sz w:val="24"/>
           <w:szCs w:val="24"/>
@@ -2294,6 +4027,8 @@
           <w:rFonts w:ascii="Times New Roman" w:eastAsia="Times New Roman" w:hAnsi="Times New Roman" w:cs="Times New Roman"/>
           <w:b/>
           <w:bCs/>
+          <w:i/>
+          <w:iCs/>
           <w:sz w:val="24"/>
           <w:szCs w:val="24"/>
           <w:lang w:val="en-GB" w:eastAsia="en-GB"/>
@@ -2304,6 +4039,8 @@
           <w:rFonts w:ascii="Times New Roman" w:eastAsia="Times New Roman" w:hAnsi="Times New Roman" w:cs="Times New Roman"/>
           <w:b/>
           <w:bCs/>
+          <w:i/>
+          <w:iCs/>
           <w:sz w:val="24"/>
           <w:szCs w:val="24"/>
           <w:lang w:val="en-GB" w:eastAsia="en-GB"/>
@@ -2413,71 +4150,28 @@
     </w:p>
     <w:p>
       <w:pPr>
-        <w:spacing w:before="100" w:beforeAutospacing="1" w:after="100" w:afterAutospacing="1" w:line="240" w:lineRule="auto"/>
+        <w:pStyle w:val="Heading2"/>
         <w:rPr>
           <w:rFonts w:ascii="Times New Roman" w:eastAsia="Times New Roman" w:hAnsi="Times New Roman" w:cs="Times New Roman"/>
-          <w:b/>
-          <w:bCs/>
-          <w:sz w:val="28"/>
-          <w:szCs w:val="28"/>
-          <w:lang w:val="en-GB" w:eastAsia="en-GB"/>
-        </w:rPr>
-      </w:pPr>
-    </w:p>
-    <w:p>
-      <w:pPr>
-        <w:spacing w:before="100" w:beforeAutospacing="1" w:after="100" w:afterAutospacing="1" w:line="240" w:lineRule="auto"/>
-        <w:rPr>
-          <w:rFonts w:ascii="Times New Roman" w:eastAsia="Times New Roman" w:hAnsi="Times New Roman" w:cs="Times New Roman"/>
-          <w:b/>
-          <w:bCs/>
-          <w:sz w:val="28"/>
-          <w:szCs w:val="28"/>
-          <w:lang w:val="en-GB" w:eastAsia="en-GB"/>
-        </w:rPr>
-      </w:pPr>
-    </w:p>
-    <w:p>
-      <w:pPr>
-        <w:spacing w:before="100" w:beforeAutospacing="1" w:after="100" w:afterAutospacing="1" w:line="240" w:lineRule="auto"/>
-        <w:rPr>
-          <w:rFonts w:ascii="Times New Roman" w:eastAsia="Times New Roman" w:hAnsi="Times New Roman" w:cs="Times New Roman"/>
-          <w:b/>
-          <w:bCs/>
-          <w:sz w:val="28"/>
-          <w:szCs w:val="28"/>
-          <w:lang w:val="en-GB" w:eastAsia="en-GB"/>
-        </w:rPr>
-      </w:pPr>
-    </w:p>
-    <w:p>
-      <w:pPr>
-        <w:spacing w:before="100" w:beforeAutospacing="1" w:after="100" w:afterAutospacing="1" w:line="240" w:lineRule="auto"/>
-        <w:rPr>
-          <w:rFonts w:ascii="Times New Roman" w:eastAsia="Times New Roman" w:hAnsi="Times New Roman" w:cs="Times New Roman"/>
-          <w:b/>
-          <w:bCs/>
           <w:i/>
           <w:iCs/>
-          <w:sz w:val="28"/>
-          <w:szCs w:val="28"/>
+          <w:color w:val="000000" w:themeColor="text1"/>
           <w:lang w:val="en-GB" w:eastAsia="en-GB"/>
         </w:rPr>
       </w:pPr>
+      <w:bookmarkStart w:id="73" w:name="_Toc243561956"/>
       <w:r>
         <w:rPr>
           <w:rFonts w:ascii="Times New Roman" w:eastAsia="Times New Roman" w:hAnsi="Times New Roman" w:cs="Times New Roman"/>
-          <w:b/>
-          <w:bCs/>
           <w:i/>
           <w:iCs/>
-          <w:sz w:val="28"/>
-          <w:szCs w:val="28"/>
+          <w:color w:val="000000" w:themeColor="text1"/>
           <w:lang w:val="en-GB" w:eastAsia="en-GB"/>
         </w:rPr>
         <w:lastRenderedPageBreak/>
         <w:t>Methodology</w:t>
       </w:r>
+      <w:bookmarkEnd w:id="73"/>
     </w:p>
     <w:p>
       <w:pPr>
@@ -2659,31 +4353,27 @@
     </w:p>
     <w:p>
       <w:pPr>
-        <w:spacing w:before="100" w:beforeAutospacing="1" w:after="100" w:afterAutospacing="1" w:line="240" w:lineRule="auto"/>
+        <w:pStyle w:val="Heading2"/>
         <w:rPr>
           <w:rFonts w:ascii="Times New Roman" w:eastAsia="Times New Roman" w:hAnsi="Times New Roman" w:cs="Times New Roman"/>
-          <w:b/>
-          <w:bCs/>
           <w:i/>
           <w:iCs/>
-          <w:sz w:val="28"/>
-          <w:szCs w:val="28"/>
+          <w:color w:val="000000" w:themeColor="text1"/>
           <w:lang w:val="en-GB" w:eastAsia="en-GB"/>
         </w:rPr>
       </w:pPr>
+      <w:bookmarkStart w:id="74" w:name="_Toc243561957"/>
       <w:r>
         <w:rPr>
           <w:rFonts w:ascii="Times New Roman" w:eastAsia="Times New Roman" w:hAnsi="Times New Roman" w:cs="Times New Roman"/>
-          <w:b/>
-          <w:bCs/>
           <w:i/>
           <w:iCs/>
-          <w:sz w:val="28"/>
-          <w:szCs w:val="28"/>
+          <w:color w:val="000000" w:themeColor="text1"/>
           <w:lang w:val="en-GB" w:eastAsia="en-GB"/>
         </w:rPr>
         <w:t>Data Sources</w:t>
       </w:r>
+      <w:bookmarkEnd w:id="74"/>
     </w:p>
     <w:p>
       <w:pPr>
@@ -2825,27 +4515,27 @@
     </w:p>
     <w:p>
       <w:pPr>
-        <w:spacing w:before="100" w:beforeAutospacing="1" w:after="100" w:afterAutospacing="1" w:line="240" w:lineRule="auto"/>
+        <w:pStyle w:val="Heading2"/>
         <w:rPr>
           <w:rFonts w:ascii="Times New Roman" w:eastAsia="Times New Roman" w:hAnsi="Times New Roman" w:cs="Times New Roman"/>
           <w:i/>
           <w:iCs/>
+          <w:color w:val="000000" w:themeColor="text1"/>
           <w:lang w:val="en-GB" w:eastAsia="en-GB"/>
         </w:rPr>
       </w:pPr>
+      <w:bookmarkStart w:id="75" w:name="_Toc243561958"/>
       <w:r>
         <w:rPr>
           <w:rFonts w:ascii="Times New Roman" w:eastAsia="Times New Roman" w:hAnsi="Times New Roman" w:cs="Times New Roman"/>
-          <w:b/>
-          <w:bCs/>
           <w:i/>
           <w:iCs/>
-          <w:sz w:val="28"/>
-          <w:szCs w:val="28"/>
+          <w:color w:val="000000" w:themeColor="text1"/>
           <w:lang w:val="en-GB" w:eastAsia="en-GB"/>
         </w:rPr>
         <w:t>Expected Deliverables</w:t>
       </w:r>
+      <w:bookmarkEnd w:id="75"/>
     </w:p>
     <w:p>
       <w:pPr>
@@ -3020,31 +4710,27 @@
     </w:p>
     <w:p>
       <w:pPr>
-        <w:spacing w:before="100" w:beforeAutospacing="1" w:after="100" w:afterAutospacing="1" w:line="240" w:lineRule="auto"/>
-        <w:rPr>
-          <w:rFonts w:ascii="Times New Roman" w:hAnsi="Times New Roman" w:cs="Times New Roman"/>
-          <w:b/>
-          <w:bCs/>
+        <w:pStyle w:val="Heading2"/>
+        <w:rPr>
+          <w:rFonts w:ascii="Times New Roman" w:hAnsi="Times New Roman" w:cs="Times New Roman"/>
           <w:i/>
+          <w:iCs/>
           <w:color w:val="000000" w:themeColor="text1"/>
-          <w:sz w:val="28"/>
-          <w:szCs w:val="28"/>
-          <w:lang w:val="en-GB"/>
-        </w:rPr>
-      </w:pPr>
-      <w:r>
-        <w:rPr>
-          <w:rFonts w:ascii="Times New Roman" w:hAnsi="Times New Roman" w:cs="Times New Roman"/>
-          <w:b/>
-          <w:bCs/>
+          <w:lang w:val="en-GB"/>
+        </w:rPr>
+      </w:pPr>
+      <w:bookmarkStart w:id="76" w:name="_Toc243561959"/>
+      <w:r>
+        <w:rPr>
+          <w:rFonts w:ascii="Times New Roman" w:hAnsi="Times New Roman" w:cs="Times New Roman"/>
           <w:i/>
+          <w:iCs/>
           <w:color w:val="000000" w:themeColor="text1"/>
-          <w:sz w:val="28"/>
-          <w:szCs w:val="28"/>
           <w:lang w:val="en-GB"/>
         </w:rPr>
         <w:t>Project Timeline</w:t>
       </w:r>
+      <w:bookmarkEnd w:id="76"/>
     </w:p>
     <w:p>
       <w:pPr>
@@ -3183,74 +4869,79 @@
     </w:p>
     <w:p>
       <w:pPr>
-        <w:rPr>
-          <w:rFonts w:ascii="Times New Roman" w:hAnsi="Times New Roman" w:cs="Times New Roman"/>
-          <w:b/>
-          <w:bCs/>
+        <w:pStyle w:val="Heading2"/>
+        <w:rPr>
+          <w:rFonts w:ascii="Times New Roman" w:hAnsi="Times New Roman" w:cs="Times New Roman"/>
           <w:i/>
           <w:iCs/>
-          <w:sz w:val="28"/>
-          <w:szCs w:val="28"/>
-        </w:rPr>
-      </w:pPr>
-      <w:r>
-        <w:rPr>
-          <w:rFonts w:ascii="Times New Roman" w:hAnsi="Times New Roman" w:cs="Times New Roman"/>
-          <w:b/>
-          <w:bCs/>
+          <w:color w:val="000000" w:themeColor="text1"/>
+        </w:rPr>
+      </w:pPr>
+      <w:bookmarkStart w:id="77" w:name="_Toc243561960"/>
+      <w:r>
+        <w:rPr>
+          <w:rFonts w:ascii="Times New Roman" w:hAnsi="Times New Roman" w:cs="Times New Roman"/>
           <w:i/>
           <w:iCs/>
-          <w:sz w:val="28"/>
-          <w:szCs w:val="28"/>
-        </w:rPr>
-        <w:t xml:space="preserve">Ethical and Legal Considerations </w:t>
-      </w:r>
-    </w:p>
-    <w:p>
-      <w:pPr>
-        <w:rPr>
-          <w:rFonts w:ascii="Times New Roman" w:hAnsi="Times New Roman" w:cs="Times New Roman"/>
-          <w:lang w:val="en-GB"/>
-        </w:rPr>
-      </w:pPr>
-      <w:r>
-        <w:rPr>
-          <w:rFonts w:ascii="Times New Roman" w:hAnsi="Times New Roman" w:cs="Times New Roman"/>
-          <w:lang w:val="en-GB"/>
-        </w:rPr>
-        <w:t>This project will use publicly available datasets from NYC Open Data, complying with the applicable Terms of Use and acknowledging all sources. As the selected dataset contains aggregated environmental and health indicators rather than individual patient records, privacy risks are limited. Project files will be managed securely, and the GitHub repository will contain code and documentation without confidential information. The results will be interpreted responsibly, avoiding causal claims and acknowledging data limitations and potential biases.</w:t>
-      </w:r>
-    </w:p>
-    <w:p>
-      <w:pPr>
-        <w:rPr>
-          <w:rFonts w:ascii="Times New Roman" w:hAnsi="Times New Roman" w:cs="Times New Roman"/>
-          <w:lang w:val="en-GB"/>
-        </w:rPr>
-      </w:pPr>
-    </w:p>
-    <w:p>
-      <w:pPr>
-        <w:rPr>
-          <w:rFonts w:ascii="Times New Roman" w:hAnsi="Times New Roman" w:cs="Times New Roman"/>
-          <w:b/>
+          <w:color w:val="000000" w:themeColor="text1"/>
+        </w:rPr>
+        <w:t>Ethical and Legal Considerations</w:t>
+      </w:r>
+      <w:bookmarkEnd w:id="77"/>
+      <w:r>
+        <w:rPr>
+          <w:rFonts w:ascii="Times New Roman" w:hAnsi="Times New Roman" w:cs="Times New Roman"/>
           <w:i/>
           <w:iCs/>
-          <w:sz w:val="28"/>
-          <w:szCs w:val="28"/>
-        </w:rPr>
-      </w:pPr>
-      <w:r>
-        <w:rPr>
-          <w:rFonts w:ascii="Times New Roman" w:hAnsi="Times New Roman" w:cs="Times New Roman"/>
-          <w:b/>
+          <w:color w:val="000000" w:themeColor="text1"/>
+        </w:rPr>
+        <w:t xml:space="preserve"> </w:t>
+      </w:r>
+    </w:p>
+    <w:p>
+      <w:pPr>
+        <w:rPr>
+          <w:rFonts w:ascii="Times New Roman" w:hAnsi="Times New Roman" w:cs="Times New Roman"/>
+          <w:lang w:val="en-GB"/>
+        </w:rPr>
+      </w:pPr>
+      <w:r>
+        <w:rPr>
+          <w:rFonts w:ascii="Times New Roman" w:hAnsi="Times New Roman" w:cs="Times New Roman"/>
+          <w:lang w:val="en-GB"/>
+        </w:rPr>
+        <w:t>This project will use publicly available datasets from NYC Open Data, complying with the applicable Terms of Use and acknowledging all sources. As the selected dataset contains aggregated environmental and health indicators rather than individual patient records, privacy risks are limited. Project files will be managed securely, and the GitHub repository will contain code and documentation without confidential information. The results will be interpreted responsibly, avoiding causal claims and acknowledging data limitations and potential biases.</w:t>
+      </w:r>
+    </w:p>
+    <w:p>
+      <w:pPr>
+        <w:rPr>
+          <w:rFonts w:ascii="Times New Roman" w:hAnsi="Times New Roman" w:cs="Times New Roman"/>
+          <w:lang w:val="en-GB"/>
+        </w:rPr>
+      </w:pPr>
+    </w:p>
+    <w:p>
+      <w:pPr>
+        <w:pStyle w:val="Heading2"/>
+        <w:rPr>
+          <w:rFonts w:ascii="Times New Roman" w:hAnsi="Times New Roman" w:cs="Times New Roman"/>
           <w:i/>
           <w:iCs/>
-          <w:sz w:val="28"/>
-          <w:szCs w:val="28"/>
+          <w:color w:val="000000" w:themeColor="text1"/>
+        </w:rPr>
+      </w:pPr>
+      <w:bookmarkStart w:id="78" w:name="_Toc243561961"/>
+      <w:r>
+        <w:rPr>
+          <w:rFonts w:ascii="Times New Roman" w:hAnsi="Times New Roman" w:cs="Times New Roman"/>
+          <w:i/>
+          <w:iCs/>
+          <w:color w:val="000000" w:themeColor="text1"/>
         </w:rPr>
         <w:t>Use of AI Tools</w:t>
       </w:r>
+      <w:bookmarkEnd w:id="78"/>
     </w:p>
     <w:p>
       <w:pPr>
@@ -3327,13 +5018,18 @@
                               <w:textDirection w:val="btLr"/>
                               <w:rPr>
                                 <w:rFonts w:ascii="Times New Roman" w:hAnsi="Times New Roman" w:cs="Times New Roman"/>
+                                <w:color w:val="000000" w:themeColor="text1"/>
+                                <w:sz w:val="24"/>
+                                <w:szCs w:val="24"/>
                               </w:rPr>
                             </w:pPr>
                             <w:r>
                               <w:rPr>
                                 <w:rFonts w:ascii="Times New Roman" w:hAnsi="Times New Roman" w:cs="Times New Roman"/>
                                 <w:b/>
-                                <w:color w:val="156082"/>
+                                <w:color w:val="000000" w:themeColor="text1"/>
+                                <w:sz w:val="24"/>
+                                <w:szCs w:val="24"/>
                               </w:rPr>
                               <w:t>Declaration</w:t>
                             </w:r>
@@ -3431,13 +5127,18 @@
                         <w:textDirection w:val="btLr"/>
                         <w:rPr>
                           <w:rFonts w:ascii="Times New Roman" w:hAnsi="Times New Roman" w:cs="Times New Roman"/>
+                          <w:color w:val="000000" w:themeColor="text1"/>
+                          <w:sz w:val="24"/>
+                          <w:szCs w:val="24"/>
                         </w:rPr>
                       </w:pPr>
                       <w:r>
                         <w:rPr>
                           <w:rFonts w:ascii="Times New Roman" w:hAnsi="Times New Roman" w:cs="Times New Roman"/>
                           <w:b/>
-                          <w:color w:val="156082"/>
+                          <w:color w:val="000000" w:themeColor="text1"/>
+                          <w:sz w:val="24"/>
+                          <w:szCs w:val="24"/>
                         </w:rPr>
                         <w:t>Declaration</w:t>
                       </w:r>
@@ -3617,12 +5318,52 @@
           <w:rFonts w:ascii="Times New Roman" w:hAnsi="Times New Roman" w:cs="Times New Roman"/>
           <w:b/>
           <w:bCs/>
+          <w:i/>
+          <w:iCs/>
           <w:sz w:val="24"/>
           <w:szCs w:val="24"/>
           <w:lang w:val="en-GB"/>
         </w:rPr>
       </w:pPr>
       <w:r>
+        <w:rPr>
+          <w:rFonts w:ascii="Times New Roman" w:hAnsi="Times New Roman" w:cs="Times New Roman"/>
+          <w:b/>
+          <w:bCs/>
+          <w:i/>
+          <w:iCs/>
+          <w:sz w:val="24"/>
+          <w:szCs w:val="24"/>
+          <w:lang w:val="en-GB"/>
+        </w:rPr>
+        <w:t xml:space="preserve">Delegation        </w:t>
+      </w:r>
+    </w:p>
+    <w:p>
+      <w:pPr>
+        <w:rPr>
+          <w:rFonts w:ascii="Times New Roman" w:hAnsi="Times New Roman" w:cs="Times New Roman"/>
+          <w:lang w:val="en-GB"/>
+        </w:rPr>
+      </w:pPr>
+      <w:r>
+        <w:rPr>
+          <w:rFonts w:ascii="Times New Roman" w:hAnsi="Times New Roman" w:cs="Times New Roman"/>
+          <w:lang w:val="en-GB"/>
+        </w:rPr>
+        <w:t>I developed a large part of the project through drafts written in Spanish. Once the drafts accurately reflected the ideas I wanted to express, I used AI to translate and structure the content reliably into academic English, allowing me to communicate my ideas clearly in a language other than my native language. In addition, I used AI to help format the references correctly according to Harvard referencing guidelines and to create images that could support the understanding and visualisation of the content presented in this project.</w:t>
+      </w:r>
+    </w:p>
+    <w:p>
+      <w:pPr>
+        <w:rPr>
+          <w:rFonts w:ascii="Times New Roman" w:hAnsi="Times New Roman" w:cs="Times New Roman"/>
+          <w:lang w:val="en-GB"/>
+        </w:rPr>
+      </w:pPr>
+    </w:p>
+    <w:p>
+      <w:pPr>
         <w:rPr>
           <w:rFonts w:ascii="Times New Roman" w:hAnsi="Times New Roman" w:cs="Times New Roman"/>
           <w:b/>
@@ -3631,8 +5372,7 @@
           <w:szCs w:val="24"/>
           <w:lang w:val="en-GB"/>
         </w:rPr>
-        <w:t>Delegation</w:t>
-      </w:r>
+      </w:pPr>
       <w:r>
         <w:rPr>
           <w:rFonts w:ascii="Times New Roman" w:hAnsi="Times New Roman" w:cs="Times New Roman"/>
@@ -3642,22 +5382,22 @@
           <w:szCs w:val="24"/>
           <w:lang w:val="en-GB"/>
         </w:rPr>
-        <w:t xml:space="preserve">        </w:t>
-      </w:r>
-    </w:p>
-    <w:p>
-      <w:pPr>
-        <w:rPr>
-          <w:rFonts w:ascii="Times New Roman" w:hAnsi="Times New Roman" w:cs="Times New Roman"/>
-          <w:lang w:val="en-GB"/>
-        </w:rPr>
-      </w:pPr>
-      <w:r>
-        <w:rPr>
-          <w:rFonts w:ascii="Times New Roman" w:hAnsi="Times New Roman" w:cs="Times New Roman"/>
-          <w:lang w:val="en-GB"/>
-        </w:rPr>
-        <w:t>I developed a large part of the project through drafts written in Spanish. Once the drafts accurately reflected the ideas I wanted to express, I used AI to translate and structure the content reliably into academic English, allowing me to communicate my ideas clearly in a language other than my native language. In addition, I used AI to help format the references correctly according to Harvard referencing guidelines and to create images that could support the understanding and visualisation of the content presented in this project.</w:t>
+        <w:t>Description</w:t>
+      </w:r>
+    </w:p>
+    <w:p>
+      <w:pPr>
+        <w:rPr>
+          <w:rFonts w:ascii="Times New Roman" w:hAnsi="Times New Roman" w:cs="Times New Roman"/>
+          <w:lang w:val="en-GB"/>
+        </w:rPr>
+      </w:pPr>
+      <w:r>
+        <w:rPr>
+          <w:rFonts w:ascii="Times New Roman" w:hAnsi="Times New Roman" w:cs="Times New Roman"/>
+          <w:lang w:val="en-GB"/>
+        </w:rPr>
+        <w:t>Through the exact prompts provided on the following pages, together with screenshots showing the corresponding AI-generated responses, it is possible to document precisely how and for what purposes AI was used in this project.</w:t>
       </w:r>
     </w:p>
     <w:p>
@@ -3688,31 +5428,24 @@
           <w:szCs w:val="24"/>
           <w:lang w:val="en-GB"/>
         </w:rPr>
-        <w:t>Description</w:t>
-      </w:r>
-    </w:p>
-    <w:p>
-      <w:pPr>
-        <w:rPr>
-          <w:rFonts w:ascii="Times New Roman" w:hAnsi="Times New Roman" w:cs="Times New Roman"/>
-          <w:lang w:val="en-GB"/>
-        </w:rPr>
-      </w:pPr>
-      <w:r>
-        <w:rPr>
-          <w:rFonts w:ascii="Times New Roman" w:hAnsi="Times New Roman" w:cs="Times New Roman"/>
-          <w:lang w:val="en-GB"/>
-        </w:rPr>
-        <w:t>Through the exact prompts provided on the following pages, together with screenshots showing the corresponding AI-generated responses, it is possible to document precisely how and for what purposes AI was used in this project.</w:t>
-      </w:r>
-    </w:p>
-    <w:p>
-      <w:pPr>
-        <w:rPr>
-          <w:rFonts w:ascii="Times New Roman" w:hAnsi="Times New Roman" w:cs="Times New Roman"/>
-          <w:lang w:val="en-GB"/>
-        </w:rPr>
-      </w:pPr>
+        <w:lastRenderedPageBreak/>
+        <w:t xml:space="preserve">Discernment </w:t>
+      </w:r>
+    </w:p>
+    <w:p>
+      <w:pPr>
+        <w:rPr>
+          <w:rFonts w:ascii="Times New Roman" w:hAnsi="Times New Roman" w:cs="Times New Roman"/>
+          <w:lang w:val="en-GB"/>
+        </w:rPr>
+      </w:pPr>
+      <w:r>
+        <w:rPr>
+          <w:rFonts w:ascii="Times New Roman" w:hAnsi="Times New Roman" w:cs="Times New Roman"/>
+          <w:lang w:val="en-GB"/>
+        </w:rPr>
+        <w:t>I reviewed the responses generated by ChatGPT to make sure they were clear, logical, and consistent with my original ideas. I accepted most of the responses, although some required small changes to better express what I wanted to say. I also reviewed the translations, references, and images to decide whether they were suitable for my project before including them in the assignment.</w:t>
+      </w:r>
     </w:p>
     <w:p>
       <w:pPr>
@@ -3734,23 +5467,22 @@
           <w:szCs w:val="24"/>
           <w:lang w:val="en-GB"/>
         </w:rPr>
-        <w:lastRenderedPageBreak/>
-        <w:t xml:space="preserve">Discernment </w:t>
-      </w:r>
-    </w:p>
-    <w:p>
-      <w:pPr>
-        <w:rPr>
-          <w:rFonts w:ascii="Times New Roman" w:hAnsi="Times New Roman" w:cs="Times New Roman"/>
-          <w:lang w:val="en-GB"/>
-        </w:rPr>
-      </w:pPr>
-      <w:r>
-        <w:rPr>
-          <w:rFonts w:ascii="Times New Roman" w:hAnsi="Times New Roman" w:cs="Times New Roman"/>
-          <w:lang w:val="en-GB"/>
-        </w:rPr>
-        <w:t>I reviewed the responses generated by ChatGPT to make sure they were clear, logical, and consistent with my original ideas. I accepted most of the responses, although some required small changes to better express what I wanted to say. I also reviewed the translations, references, and images to decide whether they were suitable for my project before including them in the assignment.</w:t>
+        <w:t xml:space="preserve">Diligence </w:t>
+      </w:r>
+    </w:p>
+    <w:p>
+      <w:pPr>
+        <w:rPr>
+          <w:rFonts w:ascii="Times New Roman" w:hAnsi="Times New Roman" w:cs="Times New Roman"/>
+          <w:lang w:val="en-GB"/>
+        </w:rPr>
+      </w:pPr>
+      <w:r>
+        <w:rPr>
+          <w:rFonts w:ascii="Times New Roman" w:hAnsi="Times New Roman" w:cs="Times New Roman"/>
+          <w:lang w:val="en-GB"/>
+        </w:rPr>
+        <w:t>I used ChatGPT responsibly to help me translate and structure my ideas, format references, and create images for this project. I considered privacy and data protection when working with the selected data sources and used Harvard referencing guidelines to acknowledge external sources. I reviewed the AI-generated content before using it and understand that I am responsible for checking the quality and accuracy of the final work submitted.</w:t>
       </w:r>
     </w:p>
     <w:p>
@@ -3773,23 +5505,62 @@
           <w:szCs w:val="24"/>
           <w:lang w:val="en-GB"/>
         </w:rPr>
-        <w:t xml:space="preserve">Diligence </w:t>
-      </w:r>
-    </w:p>
-    <w:p>
-      <w:pPr>
-        <w:rPr>
-          <w:rFonts w:ascii="Times New Roman" w:hAnsi="Times New Roman" w:cs="Times New Roman"/>
-          <w:lang w:val="en-GB"/>
-        </w:rPr>
-      </w:pPr>
-      <w:r>
-        <w:rPr>
-          <w:rFonts w:ascii="Times New Roman" w:hAnsi="Times New Roman" w:cs="Times New Roman"/>
-          <w:lang w:val="en-GB"/>
-        </w:rPr>
-        <w:t>I used ChatGPT responsibly to help me translate and structure my ideas, format references, and create images for this project. I considered privacy and data protection when working with the selected data sources and used Harvard referencing guidelines to acknowledge external sources. I reviewed the AI-generated content before using it and understand that I am responsible for checking the quality and accuracy of the final work submitted.</w:t>
-      </w:r>
+        <w:t xml:space="preserve">                                                                                                                                                                   </w:t>
+      </w:r>
+    </w:p>
+    <w:p>
+      <w:pPr>
+        <w:pStyle w:val="Heading3"/>
+        <w:rPr>
+          <w:rFonts w:ascii="Times New Roman" w:hAnsi="Times New Roman" w:cs="Times New Roman"/>
+          <w:i/>
+          <w:iCs/>
+          <w:color w:val="000000" w:themeColor="text1"/>
+          <w:lang w:val="en-GB"/>
+        </w:rPr>
+      </w:pPr>
+      <w:bookmarkStart w:id="79" w:name="_Toc243561962"/>
+      <w:r>
+        <w:rPr>
+          <w:rFonts w:ascii="Times New Roman" w:hAnsi="Times New Roman" w:cs="Times New Roman"/>
+          <w:i/>
+          <w:iCs/>
+          <w:color w:val="000000" w:themeColor="text1"/>
+          <w:lang w:val="en-GB"/>
+        </w:rPr>
+        <w:t>F</w:t>
+      </w:r>
+      <w:proofErr w:type="spellStart"/>
+      <w:r>
+        <w:rPr>
+          <w:rFonts w:ascii="Times New Roman" w:hAnsi="Times New Roman" w:cs="Times New Roman"/>
+          <w:i/>
+          <w:iCs/>
+          <w:color w:val="000000" w:themeColor="text1"/>
+          <w:lang w:val="en"/>
+        </w:rPr>
+        <w:t>irst</w:t>
+      </w:r>
+      <w:proofErr w:type="spellEnd"/>
+      <w:r>
+        <w:rPr>
+          <w:rFonts w:ascii="Times New Roman" w:hAnsi="Times New Roman" w:cs="Times New Roman"/>
+          <w:i/>
+          <w:iCs/>
+          <w:color w:val="000000" w:themeColor="text1"/>
+          <w:lang w:val="en"/>
+        </w:rPr>
+        <w:t xml:space="preserve"> use of AI</w:t>
+      </w:r>
+      <w:bookmarkEnd w:id="79"/>
+    </w:p>
+    <w:p>
+      <w:pPr>
+        <w:pStyle w:val="Heading2"/>
+        <w:rPr>
+          <w:lang w:val="en-GB"/>
+        </w:rPr>
+      </w:pPr>
     </w:p>
     <w:p>
       <w:pPr>
@@ -3811,9 +5582,33 @@
           <w:szCs w:val="24"/>
           <w:lang w:val="en-GB"/>
         </w:rPr>
-        <w:t xml:space="preserve">                                                                                                                                                                   </w:t>
-      </w:r>
-      <w:r>
+        <w:t>Date</w:t>
+      </w:r>
+    </w:p>
+    <w:p>
+      <w:pPr>
+        <w:rPr>
+          <w:rFonts w:ascii="Times New Roman" w:hAnsi="Times New Roman" w:cs="Times New Roman"/>
+          <w:lang w:val="en-GB"/>
+        </w:rPr>
+      </w:pPr>
+      <w:r>
+        <w:rPr>
+          <w:rFonts w:ascii="Times New Roman" w:hAnsi="Times New Roman" w:cs="Times New Roman"/>
+          <w:lang w:val="en-GB"/>
+        </w:rPr>
+        <w:t>19</w:t>
+      </w:r>
+      <w:r>
+        <w:rPr>
+          <w:rFonts w:ascii="Times New Roman" w:hAnsi="Times New Roman" w:cs="Times New Roman"/>
+          <w:lang w:val="en-GB"/>
+        </w:rPr>
+        <w:t>/10/2026</w:t>
+      </w:r>
+    </w:p>
+    <w:p>
+      <w:pPr>
         <w:rPr>
           <w:rFonts w:ascii="Times New Roman" w:hAnsi="Times New Roman" w:cs="Times New Roman"/>
           <w:b/>
@@ -3822,33 +5617,8 @@
           <w:szCs w:val="24"/>
           <w:lang w:val="en-GB"/>
         </w:rPr>
-        <w:t>Date</w:t>
-      </w:r>
-    </w:p>
-    <w:p>
-      <w:pPr>
-        <w:rPr>
-          <w:rFonts w:ascii="Times New Roman" w:hAnsi="Times New Roman" w:cs="Times New Roman"/>
-          <w:lang w:val="en-GB"/>
-        </w:rPr>
-      </w:pPr>
-      <w:r>
-        <w:rPr>
-          <w:rFonts w:ascii="Times New Roman" w:hAnsi="Times New Roman" w:cs="Times New Roman"/>
-          <w:lang w:val="en-GB"/>
-        </w:rPr>
-        <w:t>19</w:t>
-      </w:r>
-      <w:r>
-        <w:rPr>
-          <w:rFonts w:ascii="Times New Roman" w:hAnsi="Times New Roman" w:cs="Times New Roman"/>
-          <w:lang w:val="en-GB"/>
-        </w:rPr>
-        <w:t>/10/2026</w:t>
-      </w:r>
-    </w:p>
-    <w:p>
-      <w:pPr>
+      </w:pPr>
+      <w:r>
         <w:rPr>
           <w:rFonts w:ascii="Times New Roman" w:hAnsi="Times New Roman" w:cs="Times New Roman"/>
           <w:b/>
@@ -3857,8 +5627,24 @@
           <w:szCs w:val="24"/>
           <w:lang w:val="en-GB"/>
         </w:rPr>
-      </w:pPr>
-      <w:r>
+        <w:t xml:space="preserve">Purpose </w:t>
+      </w:r>
+    </w:p>
+    <w:p>
+      <w:pPr>
+        <w:rPr>
+          <w:rFonts w:ascii="Times New Roman" w:hAnsi="Times New Roman" w:cs="Times New Roman"/>
+        </w:rPr>
+      </w:pPr>
+      <w:r>
+        <w:rPr>
+          <w:rFonts w:ascii="Times New Roman" w:hAnsi="Times New Roman" w:cs="Times New Roman"/>
+        </w:rPr>
+        <w:t>To correctly structure and translate into English the Spanish drafts prepared for the different sections of this assignment. Each translated section is supported by a screenshot, accompanied by a text block containing the specific part of the assignment that was worked on.</w:t>
+      </w:r>
+    </w:p>
+    <w:p>
+      <w:pPr>
         <w:rPr>
           <w:rFonts w:ascii="Times New Roman" w:hAnsi="Times New Roman" w:cs="Times New Roman"/>
           <w:b/>
@@ -3867,24 +5653,8 @@
           <w:szCs w:val="24"/>
           <w:lang w:val="en-GB"/>
         </w:rPr>
-        <w:t xml:space="preserve">Purpose </w:t>
-      </w:r>
-    </w:p>
-    <w:p>
-      <w:pPr>
-        <w:rPr>
-          <w:rFonts w:ascii="Times New Roman" w:hAnsi="Times New Roman" w:cs="Times New Roman"/>
-        </w:rPr>
-      </w:pPr>
-      <w:r>
-        <w:rPr>
-          <w:rFonts w:ascii="Times New Roman" w:hAnsi="Times New Roman" w:cs="Times New Roman"/>
-        </w:rPr>
-        <w:t>To correctly structure and translate into English the Spanish drafts prepared for the different sections of this assignment. Each translated section is supported by a screenshot, accompanied by a text block containing the specific part of the assignment that was worked on.</w:t>
-      </w:r>
-    </w:p>
-    <w:p>
-      <w:pPr>
+      </w:pPr>
+      <w:r>
         <w:rPr>
           <w:rFonts w:ascii="Times New Roman" w:hAnsi="Times New Roman" w:cs="Times New Roman"/>
           <w:b/>
@@ -3893,8 +5663,32 @@
           <w:szCs w:val="24"/>
           <w:lang w:val="en-GB"/>
         </w:rPr>
-      </w:pPr>
-      <w:r>
+        <w:t>Prompt</w:t>
+      </w:r>
+    </w:p>
+    <w:p>
+      <w:pPr>
+        <w:rPr>
+          <w:rFonts w:ascii="Times New Roman" w:hAnsi="Times New Roman" w:cs="Times New Roman"/>
+        </w:rPr>
+      </w:pPr>
+      <w:r>
+        <w:rPr>
+          <w:rFonts w:ascii="Times New Roman" w:hAnsi="Times New Roman" w:cs="Times New Roman"/>
+          <w:lang w:val="en-GB"/>
+        </w:rPr>
+        <w:t>“Help me translate and structure my own ideas into clear, grammatically correct academic English without changing their original meaning or adding new information.</w:t>
+      </w:r>
+      <w:r>
+        <w:rPr>
+          <w:rFonts w:ascii="Times New Roman" w:hAnsi="Times New Roman" w:cs="Times New Roman"/>
+          <w:lang w:val="en-GB"/>
+        </w:rPr>
+        <w:t>”</w:t>
+      </w:r>
+    </w:p>
+    <w:p>
+      <w:pPr>
         <w:rPr>
           <w:rFonts w:ascii="Times New Roman" w:hAnsi="Times New Roman" w:cs="Times New Roman"/>
           <w:b/>
@@ -3903,32 +5697,8 @@
           <w:szCs w:val="24"/>
           <w:lang w:val="en-GB"/>
         </w:rPr>
-        <w:t>Prompt</w:t>
-      </w:r>
-    </w:p>
-    <w:p>
-      <w:pPr>
-        <w:rPr>
-          <w:rFonts w:ascii="Times New Roman" w:hAnsi="Times New Roman" w:cs="Times New Roman"/>
-        </w:rPr>
-      </w:pPr>
-      <w:r>
-        <w:rPr>
-          <w:rFonts w:ascii="Times New Roman" w:hAnsi="Times New Roman" w:cs="Times New Roman"/>
-          <w:lang w:val="en-GB"/>
-        </w:rPr>
-        <w:t>“Help me translate and structure my own ideas into clear, grammatically correct academic English without changing their original meaning or adding new information.</w:t>
-      </w:r>
-      <w:r>
-        <w:rPr>
-          <w:rFonts w:ascii="Times New Roman" w:hAnsi="Times New Roman" w:cs="Times New Roman"/>
-          <w:lang w:val="en-GB"/>
-        </w:rPr>
-        <w:t>”</w:t>
-      </w:r>
-    </w:p>
-    <w:p>
-      <w:pPr>
+      </w:pPr>
+      <w:r>
         <w:rPr>
           <w:rFonts w:ascii="Times New Roman" w:hAnsi="Times New Roman" w:cs="Times New Roman"/>
           <w:b/>
@@ -3937,16 +5707,6 @@
           <w:szCs w:val="24"/>
           <w:lang w:val="en-GB"/>
         </w:rPr>
-      </w:pPr>
-      <w:r>
-        <w:rPr>
-          <w:rFonts w:ascii="Times New Roman" w:hAnsi="Times New Roman" w:cs="Times New Roman"/>
-          <w:b/>
-          <w:bCs/>
-          <w:sz w:val="24"/>
-          <w:szCs w:val="24"/>
-          <w:lang w:val="en-GB"/>
-        </w:rPr>
         <w:t>Evaluation and Use</w:t>
       </w:r>
     </w:p>
@@ -4011,7 +5771,7 @@
           <w14:ligatures w14:val="standardContextual"/>
         </w:rPr>
         <w:drawing>
-          <wp:anchor distT="0" distB="0" distL="114300" distR="114300" simplePos="0" relativeHeight="251664384" behindDoc="1" locked="0" layoutInCell="1" allowOverlap="1" wp14:anchorId="4035B8DF" wp14:editId="5C8DF664">
+          <wp:anchor distT="0" distB="0" distL="114300" distR="114300" simplePos="0" relativeHeight="251664384" behindDoc="1" locked="0" layoutInCell="1" allowOverlap="1" wp14:anchorId="4035B8DF" wp14:editId="6D23C8D9">
             <wp:simplePos x="0" y="0"/>
             <wp:positionH relativeFrom="margin">
               <wp:posOffset>1127760</wp:posOffset>
@@ -4393,7 +6153,7 @@
           <w14:ligatures w14:val="standardContextual"/>
         </w:rPr>
         <w:drawing>
-          <wp:anchor distT="0" distB="0" distL="114300" distR="114300" simplePos="0" relativeHeight="251663360" behindDoc="0" locked="0" layoutInCell="1" allowOverlap="1" wp14:anchorId="792AB8D2" wp14:editId="247FF95C">
+          <wp:anchor distT="0" distB="0" distL="114300" distR="114300" simplePos="0" relativeHeight="251663360" behindDoc="0" locked="0" layoutInCell="1" allowOverlap="1" wp14:anchorId="792AB8D2" wp14:editId="31503591">
             <wp:simplePos x="0" y="0"/>
             <wp:positionH relativeFrom="margin">
               <wp:posOffset>876935</wp:posOffset>
@@ -4533,7 +6293,7 @@
           <w14:ligatures w14:val="standardContextual"/>
         </w:rPr>
         <w:drawing>
-          <wp:anchor distT="0" distB="0" distL="114300" distR="114300" simplePos="0" relativeHeight="251667456" behindDoc="0" locked="0" layoutInCell="1" allowOverlap="1" wp14:anchorId="29568DF9" wp14:editId="7FEC3A27">
+          <wp:anchor distT="0" distB="0" distL="114300" distR="114300" simplePos="0" relativeHeight="251667456" behindDoc="0" locked="0" layoutInCell="1" allowOverlap="1" wp14:anchorId="29568DF9" wp14:editId="234BE300">
             <wp:simplePos x="0" y="0"/>
             <wp:positionH relativeFrom="margin">
               <wp:posOffset>1308100</wp:posOffset>
@@ -4769,7 +6529,7 @@
           <w14:ligatures w14:val="standardContextual"/>
         </w:rPr>
         <w:drawing>
-          <wp:anchor distT="0" distB="0" distL="114300" distR="114300" simplePos="0" relativeHeight="251666432" behindDoc="0" locked="0" layoutInCell="1" allowOverlap="1" wp14:anchorId="4A5C75AF" wp14:editId="3BBDEAFA">
+          <wp:anchor distT="0" distB="0" distL="114300" distR="114300" simplePos="0" relativeHeight="251666432" behindDoc="0" locked="0" layoutInCell="1" allowOverlap="1" wp14:anchorId="4A5C75AF" wp14:editId="207E2B32">
             <wp:simplePos x="0" y="0"/>
             <wp:positionH relativeFrom="margin">
               <wp:posOffset>766445</wp:posOffset>
@@ -4935,7 +6695,7 @@
         </w:rPr>
         <w:lastRenderedPageBreak/>
         <w:drawing>
-          <wp:anchor distT="0" distB="0" distL="114300" distR="114300" simplePos="0" relativeHeight="251677696" behindDoc="0" locked="0" layoutInCell="1" allowOverlap="1" wp14:anchorId="6835E2E8" wp14:editId="1C4C71FE">
+          <wp:anchor distT="0" distB="0" distL="114300" distR="114300" simplePos="0" relativeHeight="251677696" behindDoc="0" locked="0" layoutInCell="1" allowOverlap="1" wp14:anchorId="6835E2E8" wp14:editId="56C6B798">
             <wp:simplePos x="0" y="0"/>
             <wp:positionH relativeFrom="margin">
               <wp:posOffset>765810</wp:posOffset>
@@ -5006,7 +6766,7 @@
           <w14:ligatures w14:val="standardContextual"/>
         </w:rPr>
         <w:drawing>
-          <wp:anchor distT="0" distB="0" distL="114300" distR="114300" simplePos="0" relativeHeight="251674624" behindDoc="0" locked="0" layoutInCell="1" allowOverlap="1" wp14:anchorId="377BED53" wp14:editId="2FCE66D9">
+          <wp:anchor distT="0" distB="0" distL="114300" distR="114300" simplePos="0" relativeHeight="251674624" behindDoc="0" locked="0" layoutInCell="1" allowOverlap="1" wp14:anchorId="377BED53" wp14:editId="4EE58907">
             <wp:simplePos x="0" y="0"/>
             <wp:positionH relativeFrom="margin">
               <wp:align>center</wp:align>
@@ -5321,7 +7081,7 @@
           <w14:ligatures w14:val="standardContextual"/>
         </w:rPr>
         <w:drawing>
-          <wp:anchor distT="0" distB="0" distL="114300" distR="114300" simplePos="0" relativeHeight="251680768" behindDoc="1" locked="0" layoutInCell="1" allowOverlap="1" wp14:anchorId="69B2A97A" wp14:editId="423614F2">
+          <wp:anchor distT="0" distB="0" distL="114300" distR="114300" simplePos="0" relativeHeight="251680768" behindDoc="1" locked="0" layoutInCell="1" allowOverlap="1" wp14:anchorId="69B2A97A" wp14:editId="135C16DB">
             <wp:simplePos x="0" y="0"/>
             <wp:positionH relativeFrom="margin">
               <wp:posOffset>770255</wp:posOffset>
@@ -5400,7 +7160,7 @@
         </w:rPr>
         <w:lastRenderedPageBreak/>
         <w:drawing>
-          <wp:anchor distT="0" distB="0" distL="114300" distR="114300" simplePos="0" relativeHeight="251683840" behindDoc="0" locked="0" layoutInCell="1" allowOverlap="1" wp14:anchorId="59169BAA" wp14:editId="730C8423">
+          <wp:anchor distT="0" distB="0" distL="114300" distR="114300" simplePos="0" relativeHeight="251683840" behindDoc="0" locked="0" layoutInCell="1" allowOverlap="1" wp14:anchorId="59169BAA" wp14:editId="1A1ADB4F">
             <wp:simplePos x="0" y="0"/>
             <wp:positionH relativeFrom="margin">
               <wp:align>center</wp:align>
@@ -7005,6 +8765,49 @@
     </w:p>
     <w:p>
       <w:pPr>
+        <w:pStyle w:val="Heading3"/>
+        <w:rPr>
+          <w:rFonts w:ascii="Times New Roman" w:hAnsi="Times New Roman" w:cs="Times New Roman"/>
+          <w:i/>
+          <w:iCs/>
+          <w:color w:val="000000" w:themeColor="text1"/>
+          <w:lang w:val="en-GB"/>
+        </w:rPr>
+      </w:pPr>
+      <w:bookmarkStart w:id="80" w:name="_Toc243561963"/>
+      <w:r>
+        <w:rPr>
+          <w:rFonts w:ascii="Times New Roman" w:hAnsi="Times New Roman" w:cs="Times New Roman"/>
+          <w:i/>
+          <w:iCs/>
+          <w:color w:val="000000" w:themeColor="text1"/>
+          <w:lang w:val="en-GB"/>
+        </w:rPr>
+        <w:lastRenderedPageBreak/>
+        <w:t>Second</w:t>
+      </w:r>
+      <w:r>
+        <w:rPr>
+          <w:rFonts w:ascii="Times New Roman" w:hAnsi="Times New Roman" w:cs="Times New Roman"/>
+          <w:i/>
+          <w:iCs/>
+          <w:color w:val="000000" w:themeColor="text1"/>
+          <w:lang w:val="en"/>
+        </w:rPr>
+        <w:t xml:space="preserve"> use of AI</w:t>
+      </w:r>
+      <w:bookmarkEnd w:id="80"/>
+    </w:p>
+    <w:p>
+      <w:pPr>
+        <w:pStyle w:val="Heading2"/>
+        <w:rPr>
+          <w:lang w:val="en-GB"/>
+        </w:rPr>
+      </w:pPr>
+    </w:p>
+    <w:p>
+      <w:pPr>
         <w:rPr>
           <w:rFonts w:ascii="Times New Roman" w:hAnsi="Times New Roman" w:cs="Times New Roman"/>
           <w:b/>
@@ -7023,7 +8826,6 @@
           <w:szCs w:val="24"/>
           <w:lang w:val="en-GB"/>
         </w:rPr>
-        <w:lastRenderedPageBreak/>
         <w:t>Date</w:t>
       </w:r>
     </w:p>
@@ -7444,7 +9246,44 @@
         </w:rPr>
         <w:br w:type="page"/>
       </w:r>
-      <w:r>
+    </w:p>
+    <w:p>
+      <w:pPr>
+        <w:pStyle w:val="Heading3"/>
+        <w:rPr>
+          <w:rFonts w:ascii="Times New Roman" w:hAnsi="Times New Roman" w:cs="Times New Roman"/>
+          <w:i/>
+          <w:iCs/>
+          <w:color w:val="000000" w:themeColor="text1"/>
+          <w:lang w:val="en-GB"/>
+        </w:rPr>
+      </w:pPr>
+      <w:bookmarkStart w:id="81" w:name="_Toc243561964"/>
+      <w:r>
+        <w:rPr>
+          <w:rFonts w:ascii="Times New Roman" w:hAnsi="Times New Roman" w:cs="Times New Roman"/>
+          <w:i/>
+          <w:iCs/>
+          <w:color w:val="000000" w:themeColor="text1"/>
+          <w:lang w:val="en-GB"/>
+        </w:rPr>
+        <w:lastRenderedPageBreak/>
+        <w:t>Third</w:t>
+      </w:r>
+      <w:r>
+        <w:rPr>
+          <w:rFonts w:ascii="Times New Roman" w:hAnsi="Times New Roman" w:cs="Times New Roman"/>
+          <w:i/>
+          <w:iCs/>
+          <w:color w:val="000000" w:themeColor="text1"/>
+          <w:lang w:val="en"/>
+        </w:rPr>
+        <w:t xml:space="preserve"> use of AI</w:t>
+      </w:r>
+      <w:bookmarkEnd w:id="81"/>
+    </w:p>
+    <w:p>
+      <w:pPr>
         <w:rPr>
           <w:rFonts w:ascii="Times New Roman" w:hAnsi="Times New Roman" w:cs="Times New Roman"/>
           <w:b/>
@@ -7453,7 +9292,24 @@
           <w:szCs w:val="24"/>
           <w:lang w:val="en-GB"/>
         </w:rPr>
-        <w:lastRenderedPageBreak/>
+      </w:pPr>
+    </w:p>
+    <w:p>
+      <w:pPr>
+        <w:rPr>
+          <w:rFonts w:ascii="Times New Roman" w:hAnsi="Times New Roman" w:cs="Times New Roman"/>
+          <w:lang w:val="en-GB"/>
+        </w:rPr>
+      </w:pPr>
+      <w:r>
+        <w:rPr>
+          <w:rFonts w:ascii="Times New Roman" w:hAnsi="Times New Roman" w:cs="Times New Roman"/>
+          <w:b/>
+          <w:bCs/>
+          <w:sz w:val="24"/>
+          <w:szCs w:val="24"/>
+          <w:lang w:val="en-GB"/>
+        </w:rPr>
         <w:t>Date</w:t>
       </w:r>
     </w:p>
@@ -7630,22 +9486,22 @@
           <w14:ligatures w14:val="standardContextual"/>
         </w:rPr>
         <w:drawing>
-          <wp:anchor distT="0" distB="0" distL="114300" distR="114300" simplePos="0" relativeHeight="251710464" behindDoc="0" locked="0" layoutInCell="1" allowOverlap="1" wp14:anchorId="37E30119" wp14:editId="57296F15">
+          <wp:anchor distT="0" distB="0" distL="114300" distR="114300" simplePos="0" relativeHeight="251710464" behindDoc="0" locked="0" layoutInCell="1" allowOverlap="1" wp14:anchorId="37E30119" wp14:editId="72C500AA">
             <wp:simplePos x="0" y="0"/>
             <wp:positionH relativeFrom="margin">
               <wp:align>center</wp:align>
             </wp:positionH>
             <wp:positionV relativeFrom="paragraph">
-              <wp:posOffset>478197</wp:posOffset>
+              <wp:posOffset>1022985</wp:posOffset>
             </wp:positionV>
-            <wp:extent cx="4128770" cy="5140325"/>
-            <wp:effectExtent l="0" t="0" r="5080" b="3175"/>
+            <wp:extent cx="3700145" cy="4606925"/>
+            <wp:effectExtent l="0" t="0" r="0" b="3175"/>
             <wp:wrapThrough wrapText="bothSides">
               <wp:wrapPolygon edited="0">
                 <wp:start x="0" y="0"/>
-                <wp:lineTo x="0" y="21533"/>
-                <wp:lineTo x="21527" y="21533"/>
-                <wp:lineTo x="21527" y="0"/>
+                <wp:lineTo x="0" y="21526"/>
+                <wp:lineTo x="21463" y="21526"/>
+                <wp:lineTo x="21463" y="0"/>
                 <wp:lineTo x="0" y="0"/>
               </wp:wrapPolygon>
             </wp:wrapThrough>
@@ -7675,7 +9531,7 @@
                   <pic:spPr>
                     <a:xfrm>
                       <a:off x="0" y="0"/>
-                      <a:ext cx="4128770" cy="5140325"/>
+                      <a:ext cx="3700145" cy="4606925"/>
                     </a:xfrm>
                     <a:prstGeom prst="rect">
                       <a:avLst/>
@@ -7703,12 +9559,33 @@
     </w:p>
     <w:p>
       <w:pPr>
-        <w:rPr>
-          <w:rFonts w:ascii="Times New Roman" w:hAnsi="Times New Roman" w:cs="Times New Roman"/>
-          <w:lang w:val="en-GB"/>
-        </w:rPr>
-      </w:pPr>
-      <w:r>
+        <w:pStyle w:val="Heading3"/>
+        <w:rPr>
+          <w:rFonts w:ascii="Times New Roman" w:hAnsi="Times New Roman" w:cs="Times New Roman"/>
+          <w:i/>
+          <w:iCs/>
+          <w:color w:val="000000" w:themeColor="text1"/>
+          <w:sz w:val="32"/>
+          <w:szCs w:val="32"/>
+          <w:lang w:val="en-GB"/>
+        </w:rPr>
+      </w:pPr>
+      <w:bookmarkStart w:id="82" w:name="_Toc243561965"/>
+      <w:r>
+        <w:rPr>
+          <w:rFonts w:ascii="Times New Roman" w:hAnsi="Times New Roman" w:cs="Times New Roman"/>
+          <w:i/>
+          <w:iCs/>
+          <w:color w:val="000000" w:themeColor="text1"/>
+          <w:lang w:val="en-GB"/>
+        </w:rPr>
+        <w:lastRenderedPageBreak/>
+        <w:t>Fourth use of IA</w:t>
+      </w:r>
+      <w:bookmarkEnd w:id="82"/>
+    </w:p>
+    <w:p>
+      <w:pPr>
         <w:rPr>
           <w:rFonts w:ascii="Times New Roman" w:hAnsi="Times New Roman" w:cs="Times New Roman"/>
           <w:b/>
@@ -7717,7 +9594,24 @@
           <w:szCs w:val="24"/>
           <w:lang w:val="en-GB"/>
         </w:rPr>
-        <w:lastRenderedPageBreak/>
+      </w:pPr>
+    </w:p>
+    <w:p>
+      <w:pPr>
+        <w:rPr>
+          <w:rFonts w:ascii="Times New Roman" w:hAnsi="Times New Roman" w:cs="Times New Roman"/>
+          <w:lang w:val="en-GB"/>
+        </w:rPr>
+      </w:pPr>
+      <w:r>
+        <w:rPr>
+          <w:rFonts w:ascii="Times New Roman" w:hAnsi="Times New Roman" w:cs="Times New Roman"/>
+          <w:b/>
+          <w:bCs/>
+          <w:sz w:val="24"/>
+          <w:szCs w:val="24"/>
+          <w:lang w:val="en-GB"/>
+        </w:rPr>
         <w:t>Date</w:t>
       </w:r>
     </w:p>
@@ -7943,22 +9837,22 @@
           <w14:ligatures w14:val="standardContextual"/>
         </w:rPr>
         <w:drawing>
-          <wp:anchor distT="0" distB="0" distL="114300" distR="114300" simplePos="0" relativeHeight="251711488" behindDoc="0" locked="0" layoutInCell="1" allowOverlap="1" wp14:anchorId="4D4ECC2E" wp14:editId="7E1F722B">
+          <wp:anchor distT="0" distB="0" distL="114300" distR="114300" simplePos="0" relativeHeight="251711488" behindDoc="0" locked="0" layoutInCell="1" allowOverlap="1" wp14:anchorId="4D4ECC2E" wp14:editId="27CBAA31">
             <wp:simplePos x="0" y="0"/>
             <wp:positionH relativeFrom="margin">
               <wp:align>center</wp:align>
             </wp:positionH>
             <wp:positionV relativeFrom="paragraph">
-              <wp:posOffset>7620</wp:posOffset>
+              <wp:posOffset>12700</wp:posOffset>
             </wp:positionV>
-            <wp:extent cx="4627245" cy="4936490"/>
-            <wp:effectExtent l="0" t="0" r="1905" b="0"/>
+            <wp:extent cx="4162425" cy="4441190"/>
+            <wp:effectExtent l="0" t="0" r="9525" b="0"/>
             <wp:wrapThrough wrapText="bothSides">
               <wp:wrapPolygon edited="0">
                 <wp:start x="0" y="0"/>
-                <wp:lineTo x="0" y="21506"/>
-                <wp:lineTo x="21520" y="21506"/>
-                <wp:lineTo x="21520" y="0"/>
+                <wp:lineTo x="0" y="21495"/>
+                <wp:lineTo x="21551" y="21495"/>
+                <wp:lineTo x="21551" y="0"/>
                 <wp:lineTo x="0" y="0"/>
               </wp:wrapPolygon>
             </wp:wrapThrough>
@@ -7988,7 +9882,7 @@
                   <pic:spPr>
                     <a:xfrm>
                       <a:off x="0" y="0"/>
-                      <a:ext cx="4627245" cy="4936490"/>
+                      <a:ext cx="4162425" cy="4441190"/>
                     </a:xfrm>
                     <a:prstGeom prst="rect">
                       <a:avLst/>
@@ -8020,27 +9914,28 @@
     </w:p>
     <w:p>
       <w:pPr>
+        <w:pStyle w:val="Heading2"/>
         <w:rPr>
           <w:rFonts w:ascii="Times New Roman" w:hAnsi="Times New Roman" w:cs="Times New Roman"/>
           <w:i/>
           <w:iCs/>
-          <w:lang w:val="en-GB"/>
-        </w:rPr>
-      </w:pPr>
+          <w:color w:val="000000" w:themeColor="text1"/>
+          <w:lang w:val="en-GB"/>
+        </w:rPr>
+      </w:pPr>
+      <w:bookmarkStart w:id="83" w:name="_Toc243561966"/>
       <w:r>
         <w:rPr>
           <w:rFonts w:ascii="Times New Roman" w:eastAsia="Times New Roman" w:hAnsi="Times New Roman" w:cs="Times New Roman"/>
-          <w:b/>
-          <w:bCs/>
           <w:i/>
           <w:iCs/>
-          <w:sz w:val="28"/>
-          <w:szCs w:val="28"/>
+          <w:color w:val="000000" w:themeColor="text1"/>
           <w:lang w:val="en-GB" w:eastAsia="en-GB"/>
         </w:rPr>
         <w:lastRenderedPageBreak/>
         <w:t>References</w:t>
       </w:r>
+      <w:bookmarkEnd w:id="83"/>
     </w:p>
     <w:p>
       <w:pPr>
@@ -8050,22 +9945,22 @@
           <w:lang w:val="en-GB" w:eastAsia="en-GB"/>
         </w:rPr>
       </w:pPr>
-      <w:r>
+    </w:p>
+    <w:p>
+      <w:pPr>
+        <w:spacing w:before="100" w:beforeAutospacing="1" w:after="100" w:afterAutospacing="1" w:line="240" w:lineRule="auto"/>
         <w:rPr>
           <w:rFonts w:ascii="Times New Roman" w:eastAsia="Times New Roman" w:hAnsi="Times New Roman" w:cs="Times New Roman"/>
           <w:lang w:val="en-GB" w:eastAsia="en-GB"/>
         </w:rPr>
-        <w:t>NYC Open Data (2026) Air Quality and Health Impacts: Data Dictionary. Available at: https://data.cityofnewyork.us/Environment/Air-Quality-and-Health-Impacts/c3uy-2p5r (Accessed: 19 October 2026).</w:t>
-      </w:r>
-    </w:p>
-    <w:p>
-      <w:pPr>
-        <w:spacing w:before="100" w:beforeAutospacing="1" w:after="100" w:afterAutospacing="1" w:line="240" w:lineRule="auto"/>
+      </w:pPr>
+      <w:r>
         <w:rPr>
           <w:rFonts w:ascii="Times New Roman" w:eastAsia="Times New Roman" w:hAnsi="Times New Roman" w:cs="Times New Roman"/>
           <w:lang w:val="en-GB" w:eastAsia="en-GB"/>
         </w:rPr>
-      </w:pPr>
+        <w:t>NYC Open Data (2026) Air Quality and Health Impacts: Data Dictionary. Available at: https://data.cityofnewyork.us/Environment/Air-Quality-and-Health-Impacts/c3uy-2p5r (Accessed: 19 October 2026).</w:t>
+      </w:r>
     </w:p>
     <w:p>
       <w:pPr>
@@ -8075,22 +9970,22 @@
           <w:lang w:val="en-GB" w:eastAsia="en-GB"/>
         </w:rPr>
       </w:pPr>
-      <w:r>
+    </w:p>
+    <w:p>
+      <w:pPr>
+        <w:spacing w:before="100" w:beforeAutospacing="1" w:after="100" w:afterAutospacing="1" w:line="240" w:lineRule="auto"/>
         <w:rPr>
           <w:rFonts w:ascii="Times New Roman" w:eastAsia="Times New Roman" w:hAnsi="Times New Roman" w:cs="Times New Roman"/>
           <w:lang w:val="en-GB" w:eastAsia="en-GB"/>
         </w:rPr>
-        <w:t>NYC Open Data (n.d.) Terms of Use. Available at: https://data.cityofnewyork.us/stories/s/Terms-of-Use/k9k7-3cje (Accessed: 19 October 2026).</w:t>
-      </w:r>
-    </w:p>
-    <w:p>
-      <w:pPr>
-        <w:spacing w:before="100" w:beforeAutospacing="1" w:after="100" w:afterAutospacing="1" w:line="240" w:lineRule="auto"/>
+      </w:pPr>
+      <w:r>
         <w:rPr>
           <w:rFonts w:ascii="Times New Roman" w:eastAsia="Times New Roman" w:hAnsi="Times New Roman" w:cs="Times New Roman"/>
           <w:lang w:val="en-GB" w:eastAsia="en-GB"/>
         </w:rPr>
-      </w:pPr>
+        <w:t>NYC Open Data (n.d.) Terms of Use. Available at: https://data.cityofnewyork.us/stories/s/Terms-of-Use/k9k7-3cje (Accessed: 19 October 2026).</w:t>
+      </w:r>
     </w:p>
     <w:p>
       <w:pPr>
@@ -8100,22 +9995,22 @@
           <w:lang w:val="en-GB" w:eastAsia="en-GB"/>
         </w:rPr>
       </w:pPr>
-      <w:r>
+    </w:p>
+    <w:p>
+      <w:pPr>
+        <w:spacing w:before="100" w:beforeAutospacing="1" w:after="100" w:afterAutospacing="1" w:line="240" w:lineRule="auto"/>
         <w:rPr>
           <w:rFonts w:ascii="Times New Roman" w:eastAsia="Times New Roman" w:hAnsi="Times New Roman" w:cs="Times New Roman"/>
           <w:lang w:val="en-GB" w:eastAsia="en-GB"/>
         </w:rPr>
-        <w:t>NYC Department of Health and Mental Hygiene (n.d.-a) Real-Time Air Quality in NYC. Available at: https://a816-dohbesp.nyc.gov/IndicatorPublic/data-features/realtime-air-quality/ (Accessed: 19 October 2026).</w:t>
-      </w:r>
-    </w:p>
-    <w:p>
-      <w:pPr>
-        <w:spacing w:before="100" w:beforeAutospacing="1" w:after="100" w:afterAutospacing="1" w:line="240" w:lineRule="auto"/>
+      </w:pPr>
+      <w:r>
         <w:rPr>
           <w:rFonts w:ascii="Times New Roman" w:eastAsia="Times New Roman" w:hAnsi="Times New Roman" w:cs="Times New Roman"/>
           <w:lang w:val="en-GB" w:eastAsia="en-GB"/>
         </w:rPr>
-      </w:pPr>
+        <w:t>NYC Department of Health and Mental Hygiene (n.d.-a) Real-Time Air Quality in NYC. Available at: https://a816-dohbesp.nyc.gov/IndicatorPublic/data-features/realtime-air-quality/ (Accessed: 19 October 2026).</w:t>
+      </w:r>
     </w:p>
     <w:p>
       <w:pPr>
@@ -8125,53 +10020,38 @@
           <w:lang w:val="en-GB" w:eastAsia="en-GB"/>
         </w:rPr>
       </w:pPr>
-      <w:r>
+    </w:p>
+    <w:p>
+      <w:pPr>
+        <w:spacing w:before="100" w:beforeAutospacing="1" w:after="100" w:afterAutospacing="1" w:line="240" w:lineRule="auto"/>
         <w:rPr>
           <w:rFonts w:ascii="Times New Roman" w:eastAsia="Times New Roman" w:hAnsi="Times New Roman" w:cs="Times New Roman"/>
           <w:lang w:val="en-GB" w:eastAsia="en-GB"/>
         </w:rPr>
-        <w:t>NYC Department of Health and Mental Hygiene (n.d.-b) Health Impacts of Air Pollution Data Explorer. Available at: https://a816-dohbesp.nyc.gov/IndicatorPublic/data-explorer/health-impacts-of-air-pollution/?id=2121&amp;MeasureID=652&amp;GeoType=UHF42&amp;TimePeriodID=282&amp;overlay=table (Accessed: 19 October 2026).</w:t>
-      </w:r>
-    </w:p>
-    <w:p>
-      <w:pPr>
-        <w:spacing w:before="100" w:beforeAutospacing="1" w:after="100" w:afterAutospacing="1" w:line="240" w:lineRule="auto"/>
+      </w:pPr>
+      <w:r>
         <w:rPr>
           <w:rFonts w:ascii="Times New Roman" w:eastAsia="Times New Roman" w:hAnsi="Times New Roman" w:cs="Times New Roman"/>
           <w:lang w:val="en-GB" w:eastAsia="en-GB"/>
         </w:rPr>
-      </w:pPr>
-    </w:p>
-    <w:p>
-      <w:pPr>
+        <w:t>NYC Department of Health and Mental Hygiene (n.d.-b) Health Impacts of Air Pollution Data Explorer. Available at: https://a816-dohbesp.nyc.gov/IndicatorPublic/data-explorer/health-impacts-of-air-pollution/?id=2121&amp;MeasureID=652&amp;GeoType=UHF42&amp;TimePeriodID=282&amp;overlay=table (Accessed: 19 October 2026).</w:t>
+      </w:r>
+    </w:p>
+    <w:p>
+      <w:pPr>
+        <w:spacing w:before="100" w:beforeAutospacing="1" w:after="100" w:afterAutospacing="1" w:line="240" w:lineRule="auto"/>
         <w:rPr>
           <w:rFonts w:ascii="Times New Roman" w:eastAsia="Times New Roman" w:hAnsi="Times New Roman" w:cs="Times New Roman"/>
           <w:lang w:val="en-GB" w:eastAsia="en-GB"/>
         </w:rPr>
       </w:pPr>
-      <w:r>
+    </w:p>
+    <w:p>
+      <w:pPr>
         <w:rPr>
           <w:rFonts w:ascii="Times New Roman" w:eastAsia="Times New Roman" w:hAnsi="Times New Roman" w:cs="Times New Roman"/>
           <w:lang w:val="en-GB" w:eastAsia="en-GB"/>
-        </w:rPr>
-        <w:br w:type="page"/>
-      </w:r>
-    </w:p>
-    <w:p>
-      <w:pPr>
-        <w:spacing w:before="100" w:beforeAutospacing="1" w:after="100" w:afterAutospacing="1" w:line="240" w:lineRule="auto"/>
-        <w:rPr>
-          <w:rFonts w:ascii="Times New Roman" w:eastAsia="Times New Roman" w:hAnsi="Times New Roman" w:cs="Times New Roman"/>
-          <w:lang w:val="en-GB" w:eastAsia="en-GB"/>
-        </w:rPr>
-      </w:pPr>
-    </w:p>
-    <w:p>
-      <w:pPr>
-        <w:rPr>
-          <w:rFonts w:ascii="Times New Roman" w:hAnsi="Times New Roman" w:cs="Times New Roman"/>
-          <w:lang w:val="en-GB"/>
-          <w:rPrChange w:id="78" w:author="Nicolas Cancino" w:date="2026-10-19T19:09:00Z" w16du:dateUtc="2026-10-19T18:09:00Z">
+          <w:rPrChange w:id="84" w:author="Nicolas Cancino" w:date="2026-10-19T19:09:00Z" w16du:dateUtc="2026-10-19T18:09:00Z">
             <w:rPr/>
           </w:rPrChange>
         </w:rPr>
@@ -9402,7 +11282,6 @@
     <w:next w:val="Normal"/>
     <w:link w:val="Heading2Char"/>
     <w:uiPriority w:val="9"/>
-    <w:semiHidden/>
     <w:unhideWhenUsed/>
     <w:qFormat/>
     <w:rsid w:val="00CA2072"/>
@@ -9425,7 +11304,6 @@
     <w:next w:val="Normal"/>
     <w:link w:val="Heading3Char"/>
     <w:uiPriority w:val="9"/>
-    <w:semiHidden/>
     <w:unhideWhenUsed/>
     <w:qFormat/>
     <w:rsid w:val="00CA2072"/>
@@ -9618,7 +11496,6 @@
     <w:basedOn w:val="DefaultParagraphFont"/>
     <w:link w:val="Heading2"/>
     <w:uiPriority w:val="9"/>
-    <w:semiHidden/>
     <w:rsid w:val="00CA2072"/>
     <w:rPr>
       <w:rFonts w:asciiTheme="majorHAnsi" w:eastAsiaTheme="majorEastAsia" w:hAnsiTheme="majorHAnsi" w:cstheme="majorBidi"/>
@@ -9632,7 +11509,6 @@
     <w:basedOn w:val="DefaultParagraphFont"/>
     <w:link w:val="Heading3"/>
     <w:uiPriority w:val="9"/>
-    <w:semiHidden/>
     <w:rsid w:val="00CA2072"/>
     <w:rPr>
       <w:rFonts w:eastAsiaTheme="majorEastAsia" w:cstheme="majorBidi"/>
@@ -10041,6 +11917,70 @@
       <w14:ligatures w14:val="none"/>
     </w:rPr>
   </w:style>
+  <w:style w:type="paragraph" w:styleId="TOCHeading">
+    <w:name w:val="TOC Heading"/>
+    <w:basedOn w:val="Heading1"/>
+    <w:next w:val="Normal"/>
+    <w:uiPriority w:val="39"/>
+    <w:unhideWhenUsed/>
+    <w:qFormat/>
+    <w:rsid w:val="00F222EA"/>
+    <w:pPr>
+      <w:spacing w:before="240" w:after="0"/>
+      <w:outlineLvl w:val="9"/>
+    </w:pPr>
+    <w:rPr>
+      <w:sz w:val="32"/>
+      <w:szCs w:val="32"/>
+      <w:lang w:val="en-GB" w:eastAsia="en-GB"/>
+    </w:rPr>
+  </w:style>
+  <w:style w:type="paragraph" w:styleId="TOC1">
+    <w:name w:val="toc 1"/>
+    <w:basedOn w:val="Normal"/>
+    <w:next w:val="Normal"/>
+    <w:autoRedefine/>
+    <w:uiPriority w:val="39"/>
+    <w:unhideWhenUsed/>
+    <w:rsid w:val="00F222EA"/>
+    <w:pPr>
+      <w:tabs>
+        <w:tab w:val="right" w:leader="dot" w:pos="8494"/>
+      </w:tabs>
+      <w:spacing w:after="100"/>
+    </w:pPr>
+    <w:rPr>
+      <w:rFonts w:ascii="Times New Roman" w:hAnsi="Times New Roman" w:cs="Times New Roman"/>
+      <w:sz w:val="40"/>
+      <w:szCs w:val="40"/>
+    </w:rPr>
+  </w:style>
+  <w:style w:type="paragraph" w:styleId="TOC2">
+    <w:name w:val="toc 2"/>
+    <w:basedOn w:val="Normal"/>
+    <w:next w:val="Normal"/>
+    <w:autoRedefine/>
+    <w:uiPriority w:val="39"/>
+    <w:unhideWhenUsed/>
+    <w:rsid w:val="00F222EA"/>
+    <w:pPr>
+      <w:spacing w:after="100"/>
+      <w:ind w:left="220"/>
+    </w:pPr>
+  </w:style>
+  <w:style w:type="paragraph" w:styleId="TOC3">
+    <w:name w:val="toc 3"/>
+    <w:basedOn w:val="Normal"/>
+    <w:next w:val="Normal"/>
+    <w:autoRedefine/>
+    <w:uiPriority w:val="39"/>
+    <w:unhideWhenUsed/>
+    <w:rsid w:val="00F222EA"/>
+    <w:pPr>
+      <w:spacing w:after="100"/>
+      <w:ind w:left="440"/>
+    </w:pPr>
+  </w:style>
 </w:styles>
 </file>
 

</xml_diff>